<commit_message>
Please enter the commit message for your changes. Lines starting with '#' will be ignored, and an empty message aborts the commit.
On branch main
Your branch is up to date with 'origin/main'.

Changes to be committed:
	modified:   project_ML_library/Library_V0.5/CMML.docx
	modified:   project_ML_library/Library_V0.5/CMML.pdf
</commit_message>
<xml_diff>
--- a/project_ML_library/Library_V0.5/CMML.docx
+++ b/project_ML_library/Library_V0.5/CMML.docx
@@ -4259,27 +4259,27 @@
       <w:proofErr w:type="spellStart"/>
       <w:r>
         <w:rPr>
-          <w:rFonts w:ascii="Times New Roman" w:hAnsi="Times New Roman" w:cs="Times New Roman"/>
-          <w:sz w:val="28"/>
-          <w:szCs w:val="28"/>
+          <w:rFonts w:ascii="Consolas" w:hAnsi="Consolas" w:cs="Times New Roman"/>
+          <w:sz w:val="24"/>
+          <w:szCs w:val="24"/>
         </w:rPr>
         <w:t>malloc_</w:t>
       </w:r>
       <w:proofErr w:type="gramStart"/>
       <w:r>
         <w:rPr>
-          <w:rFonts w:ascii="Times New Roman" w:hAnsi="Times New Roman" w:cs="Times New Roman"/>
-          <w:sz w:val="28"/>
-          <w:szCs w:val="28"/>
+          <w:rFonts w:ascii="Consolas" w:hAnsi="Consolas" w:cs="Times New Roman"/>
+          <w:sz w:val="24"/>
+          <w:szCs w:val="24"/>
         </w:rPr>
         <w:t>safe</w:t>
       </w:r>
       <w:proofErr w:type="spellEnd"/>
       <w:r>
         <w:rPr>
-          <w:rFonts w:ascii="Times New Roman" w:hAnsi="Times New Roman" w:cs="Times New Roman"/>
-          <w:sz w:val="28"/>
-          <w:szCs w:val="28"/>
+          <w:rFonts w:ascii="Consolas" w:hAnsi="Consolas" w:cs="Times New Roman"/>
+          <w:sz w:val="24"/>
+          <w:szCs w:val="24"/>
         </w:rPr>
         <w:t>(</w:t>
       </w:r>
@@ -4287,56 +4287,72 @@
       <w:proofErr w:type="gramEnd"/>
       <w:r>
         <w:rPr>
-          <w:rFonts w:ascii="Times New Roman" w:hAnsi="Times New Roman" w:cs="Times New Roman"/>
-          <w:sz w:val="28"/>
-          <w:szCs w:val="28"/>
+          <w:rFonts w:ascii="Consolas" w:hAnsi="Consolas" w:cs="Times New Roman"/>
+          <w:sz w:val="24"/>
+          <w:szCs w:val="24"/>
         </w:rPr>
         <w:t>size_t</w:t>
       </w:r>
       <w:proofErr w:type="spellEnd"/>
       <w:r>
         <w:rPr>
-          <w:rFonts w:ascii="Times New Roman" w:hAnsi="Times New Roman" w:cs="Times New Roman"/>
-          <w:sz w:val="28"/>
-          <w:szCs w:val="28"/>
-        </w:rPr>
-        <w:t xml:space="preserve"> n), which handles allocation failures in a consistent, fail-fast manner. Complementary lifecycle functions such as </w:t>
+          <w:rFonts w:ascii="Consolas" w:hAnsi="Consolas" w:cs="Times New Roman"/>
+          <w:sz w:val="24"/>
+          <w:szCs w:val="24"/>
+        </w:rPr>
+        <w:t xml:space="preserve"> n),</w:t>
+      </w:r>
+      <w:r>
+        <w:rPr>
+          <w:rFonts w:ascii="Times New Roman" w:hAnsi="Times New Roman" w:cs="Times New Roman"/>
+          <w:sz w:val="28"/>
+          <w:szCs w:val="28"/>
+        </w:rPr>
+        <w:t xml:space="preserve"> which handles allocation failures in a consistent, fail-fast manner. Complementary lifecycle functions such as </w:t>
       </w:r>
       <w:proofErr w:type="spellStart"/>
       <w:r>
         <w:rPr>
-          <w:rFonts w:ascii="Times New Roman" w:hAnsi="Times New Roman" w:cs="Times New Roman"/>
-          <w:sz w:val="28"/>
-          <w:szCs w:val="28"/>
+          <w:rFonts w:ascii="Consolas" w:hAnsi="Consolas" w:cs="Times New Roman"/>
+          <w:sz w:val="24"/>
+          <w:szCs w:val="24"/>
         </w:rPr>
         <w:t>free_</w:t>
       </w:r>
       <w:proofErr w:type="gramStart"/>
       <w:r>
         <w:rPr>
-          <w:rFonts w:ascii="Times New Roman" w:hAnsi="Times New Roman" w:cs="Times New Roman"/>
-          <w:sz w:val="28"/>
-          <w:szCs w:val="28"/>
+          <w:rFonts w:ascii="Consolas" w:hAnsi="Consolas" w:cs="Times New Roman"/>
+          <w:sz w:val="24"/>
+          <w:szCs w:val="24"/>
         </w:rPr>
         <w:t>matrix</w:t>
       </w:r>
       <w:proofErr w:type="spellEnd"/>
       <w:r>
         <w:rPr>
-          <w:rFonts w:ascii="Times New Roman" w:hAnsi="Times New Roman" w:cs="Times New Roman"/>
-          <w:sz w:val="28"/>
-          <w:szCs w:val="28"/>
+          <w:rFonts w:ascii="Consolas" w:hAnsi="Consolas" w:cs="Times New Roman"/>
+          <w:sz w:val="24"/>
+          <w:szCs w:val="24"/>
         </w:rPr>
         <w:t>(</w:t>
       </w:r>
       <w:proofErr w:type="gramEnd"/>
       <w:r>
         <w:rPr>
-          <w:rFonts w:ascii="Times New Roman" w:hAnsi="Times New Roman" w:cs="Times New Roman"/>
-          <w:sz w:val="28"/>
-          <w:szCs w:val="28"/>
-        </w:rPr>
-        <w:t>) ensure resources are released cleanly and help prevent memory leaks across the codebase.</w:t>
+          <w:rFonts w:ascii="Consolas" w:hAnsi="Consolas" w:cs="Times New Roman"/>
+          <w:sz w:val="24"/>
+          <w:szCs w:val="24"/>
+        </w:rPr>
+        <w:t>)</w:t>
+      </w:r>
+      <w:r>
+        <w:rPr>
+          <w:rFonts w:ascii="Times New Roman" w:hAnsi="Times New Roman" w:cs="Times New Roman"/>
+          <w:sz w:val="28"/>
+          <w:szCs w:val="28"/>
+        </w:rPr>
+        <w:t xml:space="preserve"> ensure resources are released cleanly and help prevent memory leaks across the codebase.</w:t>
       </w:r>
     </w:p>
     <w:p>
@@ -4361,15 +4377,41 @@
       <w:proofErr w:type="spellStart"/>
       <w:r>
         <w:rPr>
-          <w:rFonts w:ascii="Times New Roman" w:hAnsi="Times New Roman" w:cs="Times New Roman"/>
-          <w:sz w:val="28"/>
-          <w:szCs w:val="28"/>
-        </w:rPr>
-        <w:t>malloc_safe</w:t>
+          <w:rFonts w:ascii="Consolas" w:hAnsi="Consolas" w:cs="Times New Roman"/>
+          <w:sz w:val="24"/>
+          <w:szCs w:val="24"/>
+        </w:rPr>
+        <w:t>malloc_</w:t>
+      </w:r>
+      <w:proofErr w:type="gramStart"/>
+      <w:r>
+        <w:rPr>
+          <w:rFonts w:ascii="Consolas" w:hAnsi="Consolas" w:cs="Times New Roman"/>
+          <w:sz w:val="24"/>
+          <w:szCs w:val="24"/>
+        </w:rPr>
+        <w:t>safe</w:t>
       </w:r>
       <w:proofErr w:type="spellEnd"/>
       <w:r>
         <w:rPr>
+          <w:rFonts w:ascii="Consolas" w:hAnsi="Consolas" w:cs="Times New Roman"/>
+          <w:sz w:val="24"/>
+          <w:szCs w:val="24"/>
+        </w:rPr>
+        <w:t>(</w:t>
+      </w:r>
+      <w:proofErr w:type="gramEnd"/>
+      <w:r>
+        <w:rPr>
+          <w:rFonts w:ascii="Consolas" w:hAnsi="Consolas" w:cs="Times New Roman"/>
+          <w:sz w:val="24"/>
+          <w:szCs w:val="24"/>
+        </w:rPr>
+        <w:t>)</w:t>
+      </w:r>
+      <w:r>
+        <w:rPr>
           <w:rFonts w:ascii="Times New Roman" w:hAnsi="Times New Roman" w:cs="Times New Roman"/>
           <w:sz w:val="28"/>
           <w:szCs w:val="28"/>
@@ -4379,13 +4421,39 @@
       <w:proofErr w:type="spellStart"/>
       <w:r>
         <w:rPr>
-          <w:rFonts w:ascii="Times New Roman" w:hAnsi="Times New Roman" w:cs="Times New Roman"/>
-          <w:sz w:val="28"/>
-          <w:szCs w:val="28"/>
-        </w:rPr>
-        <w:t>free_matrix</w:t>
+          <w:rFonts w:ascii="Consolas" w:hAnsi="Consolas" w:cs="Times New Roman"/>
+          <w:sz w:val="24"/>
+          <w:szCs w:val="24"/>
+        </w:rPr>
+        <w:t>free_</w:t>
+      </w:r>
+      <w:proofErr w:type="gramStart"/>
+      <w:r>
+        <w:rPr>
+          <w:rFonts w:ascii="Consolas" w:hAnsi="Consolas" w:cs="Times New Roman"/>
+          <w:sz w:val="24"/>
+          <w:szCs w:val="24"/>
+        </w:rPr>
+        <w:t>matrix</w:t>
       </w:r>
       <w:proofErr w:type="spellEnd"/>
+      <w:r>
+        <w:rPr>
+          <w:rFonts w:ascii="Consolas" w:hAnsi="Consolas" w:cs="Times New Roman"/>
+          <w:sz w:val="24"/>
+          <w:szCs w:val="24"/>
+        </w:rPr>
+        <w:t>(</w:t>
+      </w:r>
+      <w:proofErr w:type="gramEnd"/>
+      <w:r>
+        <w:rPr>
+          <w:rFonts w:ascii="Consolas" w:hAnsi="Consolas" w:cs="Times New Roman"/>
+          <w:sz w:val="24"/>
+          <w:szCs w:val="24"/>
+        </w:rPr>
+        <w:t>)</w:t>
+      </w:r>
     </w:p>
     <w:p>
       <w:pPr>
@@ -4487,38 +4555,46 @@
       <w:proofErr w:type="spellStart"/>
       <w:r>
         <w:rPr>
-          <w:rFonts w:ascii="Times New Roman" w:hAnsi="Times New Roman" w:cs="Times New Roman"/>
-          <w:sz w:val="28"/>
-          <w:szCs w:val="28"/>
+          <w:rFonts w:ascii="Consolas" w:hAnsi="Consolas" w:cs="Times New Roman"/>
+          <w:sz w:val="24"/>
+          <w:szCs w:val="24"/>
         </w:rPr>
         <w:t>new_</w:t>
       </w:r>
       <w:proofErr w:type="gramStart"/>
       <w:r>
         <w:rPr>
-          <w:rFonts w:ascii="Times New Roman" w:hAnsi="Times New Roman" w:cs="Times New Roman"/>
-          <w:sz w:val="28"/>
-          <w:szCs w:val="28"/>
+          <w:rFonts w:ascii="Consolas" w:hAnsi="Consolas" w:cs="Times New Roman"/>
+          <w:sz w:val="24"/>
+          <w:szCs w:val="24"/>
         </w:rPr>
         <w:t>matrix</w:t>
       </w:r>
       <w:proofErr w:type="spellEnd"/>
       <w:r>
         <w:rPr>
-          <w:rFonts w:ascii="Times New Roman" w:hAnsi="Times New Roman" w:cs="Times New Roman"/>
-          <w:sz w:val="28"/>
-          <w:szCs w:val="28"/>
+          <w:rFonts w:ascii="Consolas" w:hAnsi="Consolas" w:cs="Times New Roman"/>
+          <w:sz w:val="24"/>
+          <w:szCs w:val="24"/>
         </w:rPr>
         <w:t>(</w:t>
       </w:r>
       <w:proofErr w:type="gramEnd"/>
       <w:r>
         <w:rPr>
-          <w:rFonts w:ascii="Times New Roman" w:hAnsi="Times New Roman" w:cs="Times New Roman"/>
-          <w:sz w:val="28"/>
-          <w:szCs w:val="28"/>
-        </w:rPr>
-        <w:t>row, col) — allocate and initialize an empty matrix.</w:t>
+          <w:rFonts w:ascii="Consolas" w:hAnsi="Consolas" w:cs="Times New Roman"/>
+          <w:sz w:val="24"/>
+          <w:szCs w:val="24"/>
+        </w:rPr>
+        <w:t>row, col)</w:t>
+      </w:r>
+      <w:r>
+        <w:rPr>
+          <w:rFonts w:ascii="Times New Roman" w:hAnsi="Times New Roman" w:cs="Times New Roman"/>
+          <w:sz w:val="28"/>
+          <w:szCs w:val="28"/>
+        </w:rPr>
+        <w:t xml:space="preserve"> — allocate and initialize an empty matrix.</w:t>
       </w:r>
     </w:p>
     <w:p>
@@ -4538,20 +4614,28 @@
       <w:proofErr w:type="gramStart"/>
       <w:r>
         <w:rPr>
-          <w:rFonts w:ascii="Times New Roman" w:hAnsi="Times New Roman" w:cs="Times New Roman"/>
-          <w:sz w:val="28"/>
-          <w:szCs w:val="28"/>
+          <w:rFonts w:ascii="Consolas" w:hAnsi="Consolas" w:cs="Times New Roman"/>
+          <w:sz w:val="24"/>
+          <w:szCs w:val="24"/>
         </w:rPr>
         <w:t>zeros(</w:t>
       </w:r>
       <w:proofErr w:type="gramEnd"/>
       <w:r>
         <w:rPr>
-          <w:rFonts w:ascii="Times New Roman" w:hAnsi="Times New Roman" w:cs="Times New Roman"/>
-          <w:sz w:val="28"/>
-          <w:szCs w:val="28"/>
-        </w:rPr>
-        <w:t>row, col) — allocate and fill with zeros.</w:t>
+          <w:rFonts w:ascii="Consolas" w:hAnsi="Consolas" w:cs="Times New Roman"/>
+          <w:sz w:val="24"/>
+          <w:szCs w:val="24"/>
+        </w:rPr>
+        <w:t xml:space="preserve">row, col) </w:t>
+      </w:r>
+      <w:r>
+        <w:rPr>
+          <w:rFonts w:ascii="Times New Roman" w:hAnsi="Times New Roman" w:cs="Times New Roman"/>
+          <w:sz w:val="28"/>
+          <w:szCs w:val="28"/>
+        </w:rPr>
+        <w:t>— allocate and fill with zeros.</w:t>
       </w:r>
     </w:p>
     <w:p>
@@ -4571,38 +4655,46 @@
       <w:proofErr w:type="spellStart"/>
       <w:r>
         <w:rPr>
-          <w:rFonts w:ascii="Times New Roman" w:hAnsi="Times New Roman" w:cs="Times New Roman"/>
-          <w:sz w:val="28"/>
-          <w:szCs w:val="28"/>
+          <w:rFonts w:ascii="Consolas" w:hAnsi="Consolas" w:cs="Times New Roman"/>
+          <w:sz w:val="24"/>
+          <w:szCs w:val="24"/>
         </w:rPr>
         <w:t>new_random_</w:t>
       </w:r>
       <w:proofErr w:type="gramStart"/>
       <w:r>
         <w:rPr>
-          <w:rFonts w:ascii="Times New Roman" w:hAnsi="Times New Roman" w:cs="Times New Roman"/>
-          <w:sz w:val="28"/>
-          <w:szCs w:val="28"/>
+          <w:rFonts w:ascii="Consolas" w:hAnsi="Consolas" w:cs="Times New Roman"/>
+          <w:sz w:val="24"/>
+          <w:szCs w:val="24"/>
         </w:rPr>
         <w:t>matrix</w:t>
       </w:r>
       <w:proofErr w:type="spellEnd"/>
       <w:r>
         <w:rPr>
-          <w:rFonts w:ascii="Times New Roman" w:hAnsi="Times New Roman" w:cs="Times New Roman"/>
-          <w:sz w:val="28"/>
-          <w:szCs w:val="28"/>
+          <w:rFonts w:ascii="Consolas" w:hAnsi="Consolas" w:cs="Times New Roman"/>
+          <w:sz w:val="24"/>
+          <w:szCs w:val="24"/>
         </w:rPr>
         <w:t>(</w:t>
       </w:r>
       <w:proofErr w:type="gramEnd"/>
       <w:r>
         <w:rPr>
-          <w:rFonts w:ascii="Times New Roman" w:hAnsi="Times New Roman" w:cs="Times New Roman"/>
-          <w:sz w:val="28"/>
-          <w:szCs w:val="28"/>
-        </w:rPr>
-        <w:t>row, col, min, max) —uniform random initialization.</w:t>
+          <w:rFonts w:ascii="Consolas" w:hAnsi="Consolas" w:cs="Times New Roman"/>
+          <w:sz w:val="24"/>
+          <w:szCs w:val="24"/>
+        </w:rPr>
+        <w:t>row, col, min, max)</w:t>
+      </w:r>
+      <w:r>
+        <w:rPr>
+          <w:rFonts w:ascii="Times New Roman" w:hAnsi="Times New Roman" w:cs="Times New Roman"/>
+          <w:sz w:val="28"/>
+          <w:szCs w:val="28"/>
+        </w:rPr>
+        <w:t xml:space="preserve"> —uniform random initialization.</w:t>
       </w:r>
     </w:p>
     <w:p>
@@ -4621,29 +4713,37 @@
       </w:pPr>
       <w:r>
         <w:rPr>
-          <w:rFonts w:ascii="Times New Roman" w:hAnsi="Times New Roman" w:cs="Times New Roman"/>
-          <w:sz w:val="28"/>
-          <w:szCs w:val="28"/>
+          <w:rFonts w:ascii="Consolas" w:hAnsi="Consolas" w:cs="Times New Roman"/>
+          <w:sz w:val="24"/>
+          <w:szCs w:val="24"/>
         </w:rPr>
         <w:t>new_gaussian_</w:t>
       </w:r>
       <w:proofErr w:type="gramStart"/>
       <w:r>
         <w:rPr>
-          <w:rFonts w:ascii="Times New Roman" w:hAnsi="Times New Roman" w:cs="Times New Roman"/>
-          <w:sz w:val="28"/>
-          <w:szCs w:val="28"/>
+          <w:rFonts w:ascii="Consolas" w:hAnsi="Consolas" w:cs="Times New Roman"/>
+          <w:sz w:val="24"/>
+          <w:szCs w:val="24"/>
         </w:rPr>
         <w:t>matrix(</w:t>
       </w:r>
       <w:proofErr w:type="gramEnd"/>
       <w:r>
         <w:rPr>
-          <w:rFonts w:ascii="Times New Roman" w:hAnsi="Times New Roman" w:cs="Times New Roman"/>
-          <w:sz w:val="28"/>
-          <w:szCs w:val="28"/>
-        </w:rPr>
-        <w:t xml:space="preserve">row, col) — Gaussian-distributed initialization (uses </w:t>
+          <w:rFonts w:ascii="Consolas" w:hAnsi="Consolas" w:cs="Times New Roman"/>
+          <w:sz w:val="24"/>
+          <w:szCs w:val="24"/>
+        </w:rPr>
+        <w:t xml:space="preserve">row, col) </w:t>
+      </w:r>
+      <w:r>
+        <w:rPr>
+          <w:rFonts w:ascii="Times New Roman" w:hAnsi="Times New Roman" w:cs="Times New Roman"/>
+          <w:sz w:val="28"/>
+          <w:szCs w:val="28"/>
+        </w:rPr>
+        <w:t xml:space="preserve">— Gaussian-distributed initialization (uses </w:t>
       </w:r>
       <w:proofErr w:type="spellStart"/>
       <w:r>
@@ -4681,27 +4781,27 @@
       <w:proofErr w:type="spellStart"/>
       <w:r>
         <w:rPr>
-          <w:rFonts w:ascii="Times New Roman" w:hAnsi="Times New Roman" w:cs="Times New Roman"/>
-          <w:sz w:val="28"/>
-          <w:szCs w:val="28"/>
+          <w:rFonts w:ascii="Consolas" w:hAnsi="Consolas" w:cs="Times New Roman"/>
+          <w:sz w:val="24"/>
+          <w:szCs w:val="24"/>
         </w:rPr>
         <w:t>array_</w:t>
       </w:r>
       <w:proofErr w:type="gramStart"/>
       <w:r>
         <w:rPr>
-          <w:rFonts w:ascii="Times New Roman" w:hAnsi="Times New Roman" w:cs="Times New Roman"/>
-          <w:sz w:val="28"/>
-          <w:szCs w:val="28"/>
+          <w:rFonts w:ascii="Consolas" w:hAnsi="Consolas" w:cs="Times New Roman"/>
+          <w:sz w:val="24"/>
+          <w:szCs w:val="24"/>
         </w:rPr>
         <w:t>matrix</w:t>
       </w:r>
       <w:proofErr w:type="spellEnd"/>
       <w:r>
         <w:rPr>
-          <w:rFonts w:ascii="Times New Roman" w:hAnsi="Times New Roman" w:cs="Times New Roman"/>
-          <w:sz w:val="28"/>
-          <w:szCs w:val="28"/>
+          <w:rFonts w:ascii="Consolas" w:hAnsi="Consolas" w:cs="Times New Roman"/>
+          <w:sz w:val="24"/>
+          <w:szCs w:val="24"/>
         </w:rPr>
         <w:t>(</w:t>
       </w:r>
@@ -4709,20 +4809,28 @@
       <w:proofErr w:type="gramEnd"/>
       <w:r>
         <w:rPr>
-          <w:rFonts w:ascii="Times New Roman" w:hAnsi="Times New Roman" w:cs="Times New Roman"/>
-          <w:sz w:val="28"/>
-          <w:szCs w:val="28"/>
+          <w:rFonts w:ascii="Consolas" w:hAnsi="Consolas" w:cs="Times New Roman"/>
+          <w:sz w:val="24"/>
+          <w:szCs w:val="24"/>
         </w:rPr>
         <w:t>arr</w:t>
       </w:r>
       <w:proofErr w:type="spellEnd"/>
       <w:r>
         <w:rPr>
-          <w:rFonts w:ascii="Times New Roman" w:hAnsi="Times New Roman" w:cs="Times New Roman"/>
-          <w:sz w:val="28"/>
-          <w:szCs w:val="28"/>
-        </w:rPr>
-        <w:t>, row, col) — wrap an existing array into a matrix copy.</w:t>
+          <w:rFonts w:ascii="Consolas" w:hAnsi="Consolas" w:cs="Times New Roman"/>
+          <w:sz w:val="24"/>
+          <w:szCs w:val="24"/>
+        </w:rPr>
+        <w:t xml:space="preserve">, row, col) </w:t>
+      </w:r>
+      <w:r>
+        <w:rPr>
+          <w:rFonts w:ascii="Times New Roman" w:hAnsi="Times New Roman" w:cs="Times New Roman"/>
+          <w:sz w:val="28"/>
+          <w:szCs w:val="28"/>
+        </w:rPr>
+        <w:t>— wrap an existing array into a matrix copy.</w:t>
       </w:r>
     </w:p>
     <w:p>
@@ -4742,38 +4850,46 @@
       <w:proofErr w:type="spellStart"/>
       <w:r>
         <w:rPr>
-          <w:rFonts w:ascii="Times New Roman" w:hAnsi="Times New Roman" w:cs="Times New Roman"/>
-          <w:sz w:val="28"/>
-          <w:szCs w:val="28"/>
+          <w:rFonts w:ascii="Consolas" w:hAnsi="Consolas" w:cs="Times New Roman"/>
+          <w:sz w:val="24"/>
+          <w:szCs w:val="24"/>
         </w:rPr>
         <w:t>copy_</w:t>
       </w:r>
       <w:proofErr w:type="gramStart"/>
       <w:r>
         <w:rPr>
-          <w:rFonts w:ascii="Times New Roman" w:hAnsi="Times New Roman" w:cs="Times New Roman"/>
-          <w:sz w:val="28"/>
-          <w:szCs w:val="28"/>
+          <w:rFonts w:ascii="Consolas" w:hAnsi="Consolas" w:cs="Times New Roman"/>
+          <w:sz w:val="24"/>
+          <w:szCs w:val="24"/>
         </w:rPr>
         <w:t>matrix</w:t>
       </w:r>
       <w:proofErr w:type="spellEnd"/>
       <w:r>
         <w:rPr>
-          <w:rFonts w:ascii="Times New Roman" w:hAnsi="Times New Roman" w:cs="Times New Roman"/>
-          <w:sz w:val="28"/>
-          <w:szCs w:val="28"/>
+          <w:rFonts w:ascii="Consolas" w:hAnsi="Consolas" w:cs="Times New Roman"/>
+          <w:sz w:val="24"/>
+          <w:szCs w:val="24"/>
         </w:rPr>
         <w:t>(</w:t>
       </w:r>
       <w:proofErr w:type="gramEnd"/>
       <w:r>
         <w:rPr>
-          <w:rFonts w:ascii="Times New Roman" w:hAnsi="Times New Roman" w:cs="Times New Roman"/>
-          <w:sz w:val="28"/>
-          <w:szCs w:val="28"/>
-        </w:rPr>
-        <w:t>const matrix *old) — deep copy of an existing matrix.</w:t>
+          <w:rFonts w:ascii="Consolas" w:hAnsi="Consolas" w:cs="Times New Roman"/>
+          <w:sz w:val="24"/>
+          <w:szCs w:val="24"/>
+        </w:rPr>
+        <w:t xml:space="preserve">const matrix *old) </w:t>
+      </w:r>
+      <w:r>
+        <w:rPr>
+          <w:rFonts w:ascii="Times New Roman" w:hAnsi="Times New Roman" w:cs="Times New Roman"/>
+          <w:sz w:val="28"/>
+          <w:szCs w:val="28"/>
+        </w:rPr>
+        <w:t>— deep copy of an existing matrix.</w:t>
       </w:r>
     </w:p>
     <w:p>
@@ -4793,38 +4909,46 @@
       <w:proofErr w:type="spellStart"/>
       <w:r>
         <w:rPr>
-          <w:rFonts w:ascii="Times New Roman" w:hAnsi="Times New Roman" w:cs="Times New Roman"/>
-          <w:sz w:val="28"/>
-          <w:szCs w:val="28"/>
+          <w:rFonts w:ascii="Consolas" w:hAnsi="Consolas" w:cs="Times New Roman"/>
+          <w:sz w:val="24"/>
+          <w:szCs w:val="24"/>
         </w:rPr>
         <w:t>free_</w:t>
       </w:r>
       <w:proofErr w:type="gramStart"/>
       <w:r>
         <w:rPr>
-          <w:rFonts w:ascii="Times New Roman" w:hAnsi="Times New Roman" w:cs="Times New Roman"/>
-          <w:sz w:val="28"/>
-          <w:szCs w:val="28"/>
+          <w:rFonts w:ascii="Consolas" w:hAnsi="Consolas" w:cs="Times New Roman"/>
+          <w:sz w:val="24"/>
+          <w:szCs w:val="24"/>
         </w:rPr>
         <w:t>matrix</w:t>
       </w:r>
       <w:proofErr w:type="spellEnd"/>
       <w:r>
         <w:rPr>
-          <w:rFonts w:ascii="Times New Roman" w:hAnsi="Times New Roman" w:cs="Times New Roman"/>
-          <w:sz w:val="28"/>
-          <w:szCs w:val="28"/>
+          <w:rFonts w:ascii="Consolas" w:hAnsi="Consolas" w:cs="Times New Roman"/>
+          <w:sz w:val="24"/>
+          <w:szCs w:val="24"/>
         </w:rPr>
         <w:t>(</w:t>
       </w:r>
       <w:proofErr w:type="gramEnd"/>
       <w:r>
         <w:rPr>
-          <w:rFonts w:ascii="Times New Roman" w:hAnsi="Times New Roman" w:cs="Times New Roman"/>
-          <w:sz w:val="28"/>
-          <w:szCs w:val="28"/>
-        </w:rPr>
-        <w:t>matrix *m) — release matrix memory (see Module 1).</w:t>
+          <w:rFonts w:ascii="Consolas" w:hAnsi="Consolas" w:cs="Times New Roman"/>
+          <w:sz w:val="24"/>
+          <w:szCs w:val="24"/>
+        </w:rPr>
+        <w:t>matrix *m)</w:t>
+      </w:r>
+      <w:r>
+        <w:rPr>
+          <w:rFonts w:ascii="Times New Roman" w:hAnsi="Times New Roman" w:cs="Times New Roman"/>
+          <w:sz w:val="28"/>
+          <w:szCs w:val="28"/>
+        </w:rPr>
+        <w:t xml:space="preserve"> — release matrix memory (see Module 1).</w:t>
       </w:r>
     </w:p>
     <w:p>
@@ -4939,56 +5063,142 @@
       <w:proofErr w:type="spellStart"/>
       <w:r>
         <w:rPr>
-          <w:rFonts w:ascii="Times New Roman" w:hAnsi="Times New Roman" w:cs="Times New Roman"/>
-          <w:sz w:val="28"/>
-          <w:szCs w:val="28"/>
-        </w:rPr>
-        <w:t>get_rows</w:t>
+          <w:rFonts w:ascii="Consolas" w:hAnsi="Consolas" w:cs="Times New Roman"/>
+          <w:sz w:val="24"/>
+          <w:szCs w:val="24"/>
+        </w:rPr>
+        <w:t>get_</w:t>
+      </w:r>
+      <w:proofErr w:type="gramStart"/>
+      <w:r>
+        <w:rPr>
+          <w:rFonts w:ascii="Consolas" w:hAnsi="Consolas" w:cs="Times New Roman"/>
+          <w:sz w:val="24"/>
+          <w:szCs w:val="24"/>
+        </w:rPr>
+        <w:t>rows</w:t>
       </w:r>
       <w:proofErr w:type="spellEnd"/>
       <w:r>
         <w:rPr>
-          <w:rFonts w:ascii="Times New Roman" w:hAnsi="Times New Roman" w:cs="Times New Roman"/>
-          <w:sz w:val="28"/>
-          <w:szCs w:val="28"/>
+          <w:rFonts w:ascii="Consolas" w:hAnsi="Consolas" w:cs="Times New Roman"/>
+          <w:sz w:val="24"/>
+          <w:szCs w:val="24"/>
+        </w:rPr>
+        <w:t>(</w:t>
+      </w:r>
+      <w:proofErr w:type="gramEnd"/>
+      <w:r>
+        <w:rPr>
+          <w:rFonts w:ascii="Consolas" w:hAnsi="Consolas" w:cs="Times New Roman"/>
+          <w:sz w:val="24"/>
+          <w:szCs w:val="24"/>
+        </w:rPr>
+        <w:t>)</w:t>
+      </w:r>
+      <w:r>
+        <w:rPr>
+          <w:rFonts w:ascii="Consolas" w:hAnsi="Consolas" w:cs="Times New Roman"/>
+          <w:sz w:val="24"/>
+          <w:szCs w:val="24"/>
         </w:rPr>
         <w:t xml:space="preserve">, </w:t>
       </w:r>
       <w:proofErr w:type="spellStart"/>
       <w:r>
         <w:rPr>
-          <w:rFonts w:ascii="Times New Roman" w:hAnsi="Times New Roman" w:cs="Times New Roman"/>
-          <w:sz w:val="28"/>
-          <w:szCs w:val="28"/>
-        </w:rPr>
-        <w:t>get_cols</w:t>
+          <w:rFonts w:ascii="Consolas" w:hAnsi="Consolas" w:cs="Times New Roman"/>
+          <w:sz w:val="24"/>
+          <w:szCs w:val="24"/>
+        </w:rPr>
+        <w:t>get_</w:t>
+      </w:r>
+      <w:proofErr w:type="gramStart"/>
+      <w:r>
+        <w:rPr>
+          <w:rFonts w:ascii="Consolas" w:hAnsi="Consolas" w:cs="Times New Roman"/>
+          <w:sz w:val="24"/>
+          <w:szCs w:val="24"/>
+        </w:rPr>
+        <w:t>cols</w:t>
       </w:r>
       <w:proofErr w:type="spellEnd"/>
       <w:r>
         <w:rPr>
-          <w:rFonts w:ascii="Times New Roman" w:hAnsi="Times New Roman" w:cs="Times New Roman"/>
-          <w:sz w:val="28"/>
-          <w:szCs w:val="28"/>
+          <w:rFonts w:ascii="Consolas" w:hAnsi="Consolas" w:cs="Times New Roman"/>
+          <w:sz w:val="24"/>
+          <w:szCs w:val="24"/>
+        </w:rPr>
+        <w:t>(</w:t>
+      </w:r>
+      <w:proofErr w:type="gramEnd"/>
+      <w:r>
+        <w:rPr>
+          <w:rFonts w:ascii="Consolas" w:hAnsi="Consolas" w:cs="Times New Roman"/>
+          <w:sz w:val="24"/>
+          <w:szCs w:val="24"/>
+        </w:rPr>
+        <w:t>)</w:t>
+      </w:r>
+      <w:r>
+        <w:rPr>
+          <w:rFonts w:ascii="Consolas" w:hAnsi="Consolas" w:cs="Times New Roman"/>
+          <w:sz w:val="24"/>
+          <w:szCs w:val="24"/>
         </w:rPr>
         <w:t xml:space="preserve">, </w:t>
       </w:r>
       <w:proofErr w:type="spellStart"/>
       <w:r>
         <w:rPr>
-          <w:rFonts w:ascii="Times New Roman" w:hAnsi="Times New Roman" w:cs="Times New Roman"/>
-          <w:sz w:val="28"/>
-          <w:szCs w:val="28"/>
-        </w:rPr>
-        <w:t>get_matrix_element</w:t>
+          <w:rFonts w:ascii="Consolas" w:hAnsi="Consolas" w:cs="Times New Roman"/>
+          <w:sz w:val="24"/>
+          <w:szCs w:val="24"/>
+        </w:rPr>
+        <w:t>get_matrix_</w:t>
+      </w:r>
+      <w:proofErr w:type="gramStart"/>
+      <w:r>
+        <w:rPr>
+          <w:rFonts w:ascii="Consolas" w:hAnsi="Consolas" w:cs="Times New Roman"/>
+          <w:sz w:val="24"/>
+          <w:szCs w:val="24"/>
+        </w:rPr>
+        <w:t>element</w:t>
       </w:r>
       <w:proofErr w:type="spellEnd"/>
       <w:r>
         <w:rPr>
-          <w:rFonts w:ascii="Times New Roman" w:hAnsi="Times New Roman" w:cs="Times New Roman"/>
-          <w:sz w:val="28"/>
-          <w:szCs w:val="28"/>
-        </w:rPr>
-        <w:t xml:space="preserve"> — dimension and element queries.</w:t>
+          <w:rFonts w:ascii="Consolas" w:hAnsi="Consolas" w:cs="Times New Roman"/>
+          <w:sz w:val="24"/>
+          <w:szCs w:val="24"/>
+        </w:rPr>
+        <w:t>(</w:t>
+      </w:r>
+      <w:proofErr w:type="gramEnd"/>
+      <w:r>
+        <w:rPr>
+          <w:rFonts w:ascii="Consolas" w:hAnsi="Consolas" w:cs="Times New Roman"/>
+          <w:sz w:val="24"/>
+          <w:szCs w:val="24"/>
+        </w:rPr>
+        <w:t>)</w:t>
+      </w:r>
+      <w:r>
+        <w:rPr>
+          <w:rFonts w:ascii="Consolas" w:hAnsi="Consolas" w:cs="Times New Roman"/>
+          <w:sz w:val="24"/>
+          <w:szCs w:val="24"/>
+        </w:rPr>
+        <w:t xml:space="preserve"> </w:t>
+      </w:r>
+      <w:r>
+        <w:rPr>
+          <w:rFonts w:ascii="Times New Roman" w:hAnsi="Times New Roman" w:cs="Times New Roman"/>
+          <w:sz w:val="28"/>
+          <w:szCs w:val="28"/>
+        </w:rPr>
+        <w:t>— dimension and element queries.</w:t>
       </w:r>
     </w:p>
     <w:p>
@@ -5008,38 +5218,98 @@
       <w:proofErr w:type="spellStart"/>
       <w:r>
         <w:rPr>
-          <w:rFonts w:ascii="Times New Roman" w:hAnsi="Times New Roman" w:cs="Times New Roman"/>
-          <w:sz w:val="28"/>
-          <w:szCs w:val="28"/>
-        </w:rPr>
-        <w:t>print_matrix</w:t>
+          <w:rFonts w:ascii="Consolas" w:hAnsi="Consolas" w:cs="Times New Roman"/>
+          <w:sz w:val="24"/>
+          <w:szCs w:val="24"/>
+        </w:rPr>
+        <w:t>print_</w:t>
+      </w:r>
+      <w:proofErr w:type="gramStart"/>
+      <w:r>
+        <w:rPr>
+          <w:rFonts w:ascii="Consolas" w:hAnsi="Consolas" w:cs="Times New Roman"/>
+          <w:sz w:val="24"/>
+          <w:szCs w:val="24"/>
+        </w:rPr>
+        <w:t>matrix</w:t>
       </w:r>
       <w:proofErr w:type="spellEnd"/>
       <w:r>
         <w:rPr>
-          <w:rFonts w:ascii="Times New Roman" w:hAnsi="Times New Roman" w:cs="Times New Roman"/>
-          <w:sz w:val="28"/>
-          <w:szCs w:val="28"/>
+          <w:rFonts w:ascii="Consolas" w:hAnsi="Consolas" w:cs="Times New Roman"/>
+          <w:sz w:val="24"/>
+          <w:szCs w:val="24"/>
+        </w:rPr>
+        <w:t>(</w:t>
+      </w:r>
+      <w:proofErr w:type="gramEnd"/>
+      <w:r>
+        <w:rPr>
+          <w:rFonts w:ascii="Consolas" w:hAnsi="Consolas" w:cs="Times New Roman"/>
+          <w:sz w:val="24"/>
+          <w:szCs w:val="24"/>
+        </w:rPr>
+        <w:t>)</w:t>
+      </w:r>
+      <w:r>
+        <w:rPr>
+          <w:rFonts w:ascii="Consolas" w:hAnsi="Consolas" w:cs="Times New Roman"/>
+          <w:sz w:val="24"/>
+          <w:szCs w:val="24"/>
         </w:rPr>
         <w:t xml:space="preserve">, </w:t>
       </w:r>
       <w:proofErr w:type="spellStart"/>
       <w:r>
         <w:rPr>
-          <w:rFonts w:ascii="Times New Roman" w:hAnsi="Times New Roman" w:cs="Times New Roman"/>
-          <w:sz w:val="28"/>
-          <w:szCs w:val="28"/>
-        </w:rPr>
-        <w:t>print_shape</w:t>
+          <w:rFonts w:ascii="Consolas" w:hAnsi="Consolas" w:cs="Times New Roman"/>
+          <w:sz w:val="24"/>
+          <w:szCs w:val="24"/>
+        </w:rPr>
+        <w:t>print_</w:t>
+      </w:r>
+      <w:proofErr w:type="gramStart"/>
+      <w:r>
+        <w:rPr>
+          <w:rFonts w:ascii="Consolas" w:hAnsi="Consolas" w:cs="Times New Roman"/>
+          <w:sz w:val="24"/>
+          <w:szCs w:val="24"/>
+        </w:rPr>
+        <w:t>shape</w:t>
       </w:r>
       <w:proofErr w:type="spellEnd"/>
       <w:r>
         <w:rPr>
-          <w:rFonts w:ascii="Times New Roman" w:hAnsi="Times New Roman" w:cs="Times New Roman"/>
-          <w:sz w:val="28"/>
-          <w:szCs w:val="28"/>
-        </w:rPr>
-        <w:t xml:space="preserve"> — human-readable output for debugging.</w:t>
+          <w:rFonts w:ascii="Consolas" w:hAnsi="Consolas" w:cs="Times New Roman"/>
+          <w:sz w:val="24"/>
+          <w:szCs w:val="24"/>
+        </w:rPr>
+        <w:t>(</w:t>
+      </w:r>
+      <w:proofErr w:type="gramEnd"/>
+      <w:r>
+        <w:rPr>
+          <w:rFonts w:ascii="Consolas" w:hAnsi="Consolas" w:cs="Times New Roman"/>
+          <w:sz w:val="24"/>
+          <w:szCs w:val="24"/>
+        </w:rPr>
+        <w:t>)</w:t>
+      </w:r>
+      <w:r>
+        <w:rPr>
+          <w:rFonts w:ascii="Consolas" w:hAnsi="Consolas" w:cs="Times New Roman"/>
+          <w:sz w:val="24"/>
+          <w:szCs w:val="24"/>
+        </w:rPr>
+        <w:t xml:space="preserve"> </w:t>
+      </w:r>
+      <w:r>
+        <w:rPr>
+          <w:rFonts w:ascii="Times New Roman" w:hAnsi="Times New Roman" w:cs="Times New Roman"/>
+          <w:sz w:val="28"/>
+          <w:szCs w:val="28"/>
+        </w:rPr>
+        <w:t>— human-readable output for debugging.</w:t>
       </w:r>
     </w:p>
     <w:p>
@@ -5059,38 +5329,46 @@
       <w:proofErr w:type="spellStart"/>
       <w:r>
         <w:rPr>
-          <w:rFonts w:ascii="Times New Roman" w:hAnsi="Times New Roman" w:cs="Times New Roman"/>
-          <w:sz w:val="28"/>
-          <w:szCs w:val="28"/>
+          <w:rFonts w:ascii="Consolas" w:hAnsi="Consolas" w:cs="Times New Roman"/>
+          <w:sz w:val="24"/>
+          <w:szCs w:val="24"/>
         </w:rPr>
         <w:t>matrix_check_</w:t>
       </w:r>
       <w:proofErr w:type="gramStart"/>
       <w:r>
         <w:rPr>
-          <w:rFonts w:ascii="Times New Roman" w:hAnsi="Times New Roman" w:cs="Times New Roman"/>
-          <w:sz w:val="28"/>
-          <w:szCs w:val="28"/>
+          <w:rFonts w:ascii="Consolas" w:hAnsi="Consolas" w:cs="Times New Roman"/>
+          <w:sz w:val="24"/>
+          <w:szCs w:val="24"/>
         </w:rPr>
         <w:t>equal</w:t>
       </w:r>
       <w:proofErr w:type="spellEnd"/>
       <w:r>
         <w:rPr>
-          <w:rFonts w:ascii="Times New Roman" w:hAnsi="Times New Roman" w:cs="Times New Roman"/>
-          <w:sz w:val="28"/>
-          <w:szCs w:val="28"/>
+          <w:rFonts w:ascii="Consolas" w:hAnsi="Consolas" w:cs="Times New Roman"/>
+          <w:sz w:val="24"/>
+          <w:szCs w:val="24"/>
         </w:rPr>
         <w:t>(</w:t>
       </w:r>
       <w:proofErr w:type="gramEnd"/>
       <w:r>
         <w:rPr>
-          <w:rFonts w:ascii="Times New Roman" w:hAnsi="Times New Roman" w:cs="Times New Roman"/>
-          <w:sz w:val="28"/>
-          <w:szCs w:val="28"/>
-        </w:rPr>
-        <w:t>a, b, tolerance) — approximate equality check for tests.</w:t>
+          <w:rFonts w:ascii="Consolas" w:hAnsi="Consolas" w:cs="Times New Roman"/>
+          <w:sz w:val="24"/>
+          <w:szCs w:val="24"/>
+        </w:rPr>
+        <w:t xml:space="preserve">a, b, tolerance) </w:t>
+      </w:r>
+      <w:r>
+        <w:rPr>
+          <w:rFonts w:ascii="Times New Roman" w:hAnsi="Times New Roman" w:cs="Times New Roman"/>
+          <w:sz w:val="28"/>
+          <w:szCs w:val="28"/>
+        </w:rPr>
+        <w:t>— approximate equality check for tests.</w:t>
       </w:r>
     </w:p>
     <w:p>
@@ -5133,38 +5411,98 @@
       <w:proofErr w:type="spellStart"/>
       <w:r>
         <w:rPr>
-          <w:rFonts w:ascii="Times New Roman" w:hAnsi="Times New Roman" w:cs="Times New Roman"/>
-          <w:sz w:val="28"/>
-          <w:szCs w:val="28"/>
-        </w:rPr>
-        <w:t>set_matrix</w:t>
+          <w:rFonts w:ascii="Consolas" w:hAnsi="Consolas" w:cs="Times New Roman"/>
+          <w:sz w:val="24"/>
+          <w:szCs w:val="24"/>
+        </w:rPr>
+        <w:t>set_</w:t>
+      </w:r>
+      <w:proofErr w:type="gramStart"/>
+      <w:r>
+        <w:rPr>
+          <w:rFonts w:ascii="Consolas" w:hAnsi="Consolas" w:cs="Times New Roman"/>
+          <w:sz w:val="24"/>
+          <w:szCs w:val="24"/>
+        </w:rPr>
+        <w:t>matrix</w:t>
       </w:r>
       <w:proofErr w:type="spellEnd"/>
       <w:r>
         <w:rPr>
-          <w:rFonts w:ascii="Times New Roman" w:hAnsi="Times New Roman" w:cs="Times New Roman"/>
-          <w:sz w:val="28"/>
-          <w:szCs w:val="28"/>
+          <w:rFonts w:ascii="Consolas" w:hAnsi="Consolas" w:cs="Times New Roman"/>
+          <w:sz w:val="24"/>
+          <w:szCs w:val="24"/>
+        </w:rPr>
+        <w:t>(</w:t>
+      </w:r>
+      <w:proofErr w:type="gramEnd"/>
+      <w:r>
+        <w:rPr>
+          <w:rFonts w:ascii="Consolas" w:hAnsi="Consolas" w:cs="Times New Roman"/>
+          <w:sz w:val="24"/>
+          <w:szCs w:val="24"/>
+        </w:rPr>
+        <w:t>)</w:t>
+      </w:r>
+      <w:r>
+        <w:rPr>
+          <w:rFonts w:ascii="Consolas" w:hAnsi="Consolas" w:cs="Times New Roman"/>
+          <w:sz w:val="24"/>
+          <w:szCs w:val="24"/>
         </w:rPr>
         <w:t xml:space="preserve">, </w:t>
       </w:r>
       <w:proofErr w:type="spellStart"/>
       <w:r>
         <w:rPr>
-          <w:rFonts w:ascii="Times New Roman" w:hAnsi="Times New Roman" w:cs="Times New Roman"/>
-          <w:sz w:val="28"/>
-          <w:szCs w:val="28"/>
-        </w:rPr>
-        <w:t>fill_matrix</w:t>
+          <w:rFonts w:ascii="Consolas" w:hAnsi="Consolas" w:cs="Times New Roman"/>
+          <w:sz w:val="24"/>
+          <w:szCs w:val="24"/>
+        </w:rPr>
+        <w:t>fill_</w:t>
+      </w:r>
+      <w:proofErr w:type="gramStart"/>
+      <w:r>
+        <w:rPr>
+          <w:rFonts w:ascii="Consolas" w:hAnsi="Consolas" w:cs="Times New Roman"/>
+          <w:sz w:val="24"/>
+          <w:szCs w:val="24"/>
+        </w:rPr>
+        <w:t>matrix</w:t>
       </w:r>
       <w:proofErr w:type="spellEnd"/>
       <w:r>
         <w:rPr>
-          <w:rFonts w:ascii="Times New Roman" w:hAnsi="Times New Roman" w:cs="Times New Roman"/>
-          <w:sz w:val="28"/>
-          <w:szCs w:val="28"/>
-        </w:rPr>
-        <w:t xml:space="preserve"> — element assignment and bulk fill.</w:t>
+          <w:rFonts w:ascii="Consolas" w:hAnsi="Consolas" w:cs="Times New Roman"/>
+          <w:sz w:val="24"/>
+          <w:szCs w:val="24"/>
+        </w:rPr>
+        <w:t>(</w:t>
+      </w:r>
+      <w:proofErr w:type="gramEnd"/>
+      <w:r>
+        <w:rPr>
+          <w:rFonts w:ascii="Consolas" w:hAnsi="Consolas" w:cs="Times New Roman"/>
+          <w:sz w:val="24"/>
+          <w:szCs w:val="24"/>
+        </w:rPr>
+        <w:t>)</w:t>
+      </w:r>
+      <w:r>
+        <w:rPr>
+          <w:rFonts w:ascii="Consolas" w:hAnsi="Consolas" w:cs="Times New Roman"/>
+          <w:sz w:val="24"/>
+          <w:szCs w:val="24"/>
+        </w:rPr>
+        <w:t xml:space="preserve"> </w:t>
+      </w:r>
+      <w:r>
+        <w:rPr>
+          <w:rFonts w:ascii="Times New Roman" w:hAnsi="Times New Roman" w:cs="Times New Roman"/>
+          <w:sz w:val="28"/>
+          <w:szCs w:val="28"/>
+        </w:rPr>
+        <w:t>— element assignment and bulk fill.</w:t>
       </w:r>
     </w:p>
     <w:p>
@@ -5184,38 +5522,98 @@
       <w:proofErr w:type="spellStart"/>
       <w:r>
         <w:rPr>
-          <w:rFonts w:ascii="Times New Roman" w:hAnsi="Times New Roman" w:cs="Times New Roman"/>
-          <w:sz w:val="28"/>
-          <w:szCs w:val="28"/>
-        </w:rPr>
-        <w:t>reshape_matrix</w:t>
+          <w:rFonts w:ascii="Consolas" w:hAnsi="Consolas" w:cs="Times New Roman"/>
+          <w:sz w:val="24"/>
+          <w:szCs w:val="24"/>
+        </w:rPr>
+        <w:t>reshape_</w:t>
+      </w:r>
+      <w:proofErr w:type="gramStart"/>
+      <w:r>
+        <w:rPr>
+          <w:rFonts w:ascii="Consolas" w:hAnsi="Consolas" w:cs="Times New Roman"/>
+          <w:sz w:val="24"/>
+          <w:szCs w:val="24"/>
+        </w:rPr>
+        <w:t>matrix</w:t>
       </w:r>
       <w:proofErr w:type="spellEnd"/>
       <w:r>
         <w:rPr>
-          <w:rFonts w:ascii="Times New Roman" w:hAnsi="Times New Roman" w:cs="Times New Roman"/>
-          <w:sz w:val="28"/>
-          <w:szCs w:val="28"/>
+          <w:rFonts w:ascii="Consolas" w:hAnsi="Consolas" w:cs="Times New Roman"/>
+          <w:sz w:val="24"/>
+          <w:szCs w:val="24"/>
+        </w:rPr>
+        <w:t>(</w:t>
+      </w:r>
+      <w:proofErr w:type="gramEnd"/>
+      <w:r>
+        <w:rPr>
+          <w:rFonts w:ascii="Consolas" w:hAnsi="Consolas" w:cs="Times New Roman"/>
+          <w:sz w:val="24"/>
+          <w:szCs w:val="24"/>
+        </w:rPr>
+        <w:t>)</w:t>
+      </w:r>
+      <w:r>
+        <w:rPr>
+          <w:rFonts w:ascii="Consolas" w:hAnsi="Consolas" w:cs="Times New Roman"/>
+          <w:sz w:val="24"/>
+          <w:szCs w:val="24"/>
         </w:rPr>
         <w:t xml:space="preserve">, </w:t>
       </w:r>
       <w:proofErr w:type="spellStart"/>
       <w:r>
         <w:rPr>
-          <w:rFonts w:ascii="Times New Roman" w:hAnsi="Times New Roman" w:cs="Times New Roman"/>
-          <w:sz w:val="28"/>
-          <w:szCs w:val="28"/>
-        </w:rPr>
-        <w:t>reshape_matrix_inplace</w:t>
+          <w:rFonts w:ascii="Consolas" w:hAnsi="Consolas" w:cs="Times New Roman"/>
+          <w:sz w:val="24"/>
+          <w:szCs w:val="24"/>
+        </w:rPr>
+        <w:t>reshape_matrix_</w:t>
+      </w:r>
+      <w:proofErr w:type="gramStart"/>
+      <w:r>
+        <w:rPr>
+          <w:rFonts w:ascii="Consolas" w:hAnsi="Consolas" w:cs="Times New Roman"/>
+          <w:sz w:val="24"/>
+          <w:szCs w:val="24"/>
+        </w:rPr>
+        <w:t>inplace</w:t>
       </w:r>
       <w:proofErr w:type="spellEnd"/>
       <w:r>
         <w:rPr>
-          <w:rFonts w:ascii="Times New Roman" w:hAnsi="Times New Roman" w:cs="Times New Roman"/>
-          <w:sz w:val="28"/>
-          <w:szCs w:val="28"/>
-        </w:rPr>
-        <w:t xml:space="preserve"> — safe reshaping with dimension checks.</w:t>
+          <w:rFonts w:ascii="Consolas" w:hAnsi="Consolas" w:cs="Times New Roman"/>
+          <w:sz w:val="24"/>
+          <w:szCs w:val="24"/>
+        </w:rPr>
+        <w:t>(</w:t>
+      </w:r>
+      <w:proofErr w:type="gramEnd"/>
+      <w:r>
+        <w:rPr>
+          <w:rFonts w:ascii="Consolas" w:hAnsi="Consolas" w:cs="Times New Roman"/>
+          <w:sz w:val="24"/>
+          <w:szCs w:val="24"/>
+        </w:rPr>
+        <w:t>)</w:t>
+      </w:r>
+      <w:r>
+        <w:rPr>
+          <w:rFonts w:ascii="Consolas" w:hAnsi="Consolas" w:cs="Times New Roman"/>
+          <w:sz w:val="24"/>
+          <w:szCs w:val="24"/>
+        </w:rPr>
+        <w:t xml:space="preserve"> </w:t>
+      </w:r>
+      <w:r>
+        <w:rPr>
+          <w:rFonts w:ascii="Times New Roman" w:hAnsi="Times New Roman" w:cs="Times New Roman"/>
+          <w:sz w:val="28"/>
+          <w:szCs w:val="28"/>
+        </w:rPr>
+        <w:t>— safe reshaping with dimension checks.</w:t>
       </w:r>
     </w:p>
     <w:p>
@@ -5235,56 +5633,142 @@
       <w:proofErr w:type="spellStart"/>
       <w:r>
         <w:rPr>
-          <w:rFonts w:ascii="Times New Roman" w:hAnsi="Times New Roman" w:cs="Times New Roman"/>
-          <w:sz w:val="28"/>
-          <w:szCs w:val="28"/>
-        </w:rPr>
-        <w:t>get_row</w:t>
+          <w:rFonts w:ascii="Consolas" w:hAnsi="Consolas" w:cs="Times New Roman"/>
+          <w:sz w:val="24"/>
+          <w:szCs w:val="24"/>
+        </w:rPr>
+        <w:t>get_</w:t>
+      </w:r>
+      <w:proofErr w:type="gramStart"/>
+      <w:r>
+        <w:rPr>
+          <w:rFonts w:ascii="Consolas" w:hAnsi="Consolas" w:cs="Times New Roman"/>
+          <w:sz w:val="24"/>
+          <w:szCs w:val="24"/>
+        </w:rPr>
+        <w:t>row</w:t>
       </w:r>
       <w:proofErr w:type="spellEnd"/>
       <w:r>
         <w:rPr>
-          <w:rFonts w:ascii="Times New Roman" w:hAnsi="Times New Roman" w:cs="Times New Roman"/>
-          <w:sz w:val="28"/>
-          <w:szCs w:val="28"/>
+          <w:rFonts w:ascii="Consolas" w:hAnsi="Consolas" w:cs="Times New Roman"/>
+          <w:sz w:val="24"/>
+          <w:szCs w:val="24"/>
+        </w:rPr>
+        <w:t>(</w:t>
+      </w:r>
+      <w:proofErr w:type="gramEnd"/>
+      <w:r>
+        <w:rPr>
+          <w:rFonts w:ascii="Consolas" w:hAnsi="Consolas" w:cs="Times New Roman"/>
+          <w:sz w:val="24"/>
+          <w:szCs w:val="24"/>
+        </w:rPr>
+        <w:t>)</w:t>
+      </w:r>
+      <w:r>
+        <w:rPr>
+          <w:rFonts w:ascii="Consolas" w:hAnsi="Consolas" w:cs="Times New Roman"/>
+          <w:sz w:val="24"/>
+          <w:szCs w:val="24"/>
         </w:rPr>
         <w:t xml:space="preserve">, </w:t>
       </w:r>
       <w:proofErr w:type="spellStart"/>
       <w:r>
         <w:rPr>
-          <w:rFonts w:ascii="Times New Roman" w:hAnsi="Times New Roman" w:cs="Times New Roman"/>
-          <w:sz w:val="28"/>
-          <w:szCs w:val="28"/>
-        </w:rPr>
-        <w:t>get_col</w:t>
+          <w:rFonts w:ascii="Consolas" w:hAnsi="Consolas" w:cs="Times New Roman"/>
+          <w:sz w:val="24"/>
+          <w:szCs w:val="24"/>
+        </w:rPr>
+        <w:t>get_</w:t>
+      </w:r>
+      <w:proofErr w:type="gramStart"/>
+      <w:r>
+        <w:rPr>
+          <w:rFonts w:ascii="Consolas" w:hAnsi="Consolas" w:cs="Times New Roman"/>
+          <w:sz w:val="24"/>
+          <w:szCs w:val="24"/>
+        </w:rPr>
+        <w:t>col</w:t>
       </w:r>
       <w:proofErr w:type="spellEnd"/>
       <w:r>
         <w:rPr>
-          <w:rFonts w:ascii="Times New Roman" w:hAnsi="Times New Roman" w:cs="Times New Roman"/>
-          <w:sz w:val="28"/>
-          <w:szCs w:val="28"/>
+          <w:rFonts w:ascii="Consolas" w:hAnsi="Consolas" w:cs="Times New Roman"/>
+          <w:sz w:val="24"/>
+          <w:szCs w:val="24"/>
+        </w:rPr>
+        <w:t>(</w:t>
+      </w:r>
+      <w:proofErr w:type="gramEnd"/>
+      <w:r>
+        <w:rPr>
+          <w:rFonts w:ascii="Consolas" w:hAnsi="Consolas" w:cs="Times New Roman"/>
+          <w:sz w:val="24"/>
+          <w:szCs w:val="24"/>
+        </w:rPr>
+        <w:t>)</w:t>
+      </w:r>
+      <w:r>
+        <w:rPr>
+          <w:rFonts w:ascii="Consolas" w:hAnsi="Consolas" w:cs="Times New Roman"/>
+          <w:sz w:val="24"/>
+          <w:szCs w:val="24"/>
         </w:rPr>
         <w:t xml:space="preserve">, </w:t>
       </w:r>
       <w:proofErr w:type="spellStart"/>
       <w:r>
         <w:rPr>
-          <w:rFonts w:ascii="Times New Roman" w:hAnsi="Times New Roman" w:cs="Times New Roman"/>
-          <w:sz w:val="28"/>
-          <w:szCs w:val="28"/>
-        </w:rPr>
-        <w:t>get_slice</w:t>
+          <w:rFonts w:ascii="Consolas" w:hAnsi="Consolas" w:cs="Times New Roman"/>
+          <w:sz w:val="24"/>
+          <w:szCs w:val="24"/>
+        </w:rPr>
+        <w:t>get_</w:t>
+      </w:r>
+      <w:proofErr w:type="gramStart"/>
+      <w:r>
+        <w:rPr>
+          <w:rFonts w:ascii="Consolas" w:hAnsi="Consolas" w:cs="Times New Roman"/>
+          <w:sz w:val="24"/>
+          <w:szCs w:val="24"/>
+        </w:rPr>
+        <w:t>slice</w:t>
       </w:r>
       <w:proofErr w:type="spellEnd"/>
       <w:r>
         <w:rPr>
-          <w:rFonts w:ascii="Times New Roman" w:hAnsi="Times New Roman" w:cs="Times New Roman"/>
-          <w:sz w:val="28"/>
-          <w:szCs w:val="28"/>
-        </w:rPr>
-        <w:t xml:space="preserve"> — extract 1×N, N×1, or submatrix views (as new matrices).</w:t>
+          <w:rFonts w:ascii="Consolas" w:hAnsi="Consolas" w:cs="Times New Roman"/>
+          <w:sz w:val="24"/>
+          <w:szCs w:val="24"/>
+        </w:rPr>
+        <w:t>(</w:t>
+      </w:r>
+      <w:proofErr w:type="gramEnd"/>
+      <w:r>
+        <w:rPr>
+          <w:rFonts w:ascii="Consolas" w:hAnsi="Consolas" w:cs="Times New Roman"/>
+          <w:sz w:val="24"/>
+          <w:szCs w:val="24"/>
+        </w:rPr>
+        <w:t>)</w:t>
+      </w:r>
+      <w:r>
+        <w:rPr>
+          <w:rFonts w:ascii="Consolas" w:hAnsi="Consolas" w:cs="Times New Roman"/>
+          <w:sz w:val="24"/>
+          <w:szCs w:val="24"/>
+        </w:rPr>
+        <w:t xml:space="preserve"> </w:t>
+      </w:r>
+      <w:r>
+        <w:rPr>
+          <w:rFonts w:ascii="Times New Roman" w:hAnsi="Times New Roman" w:cs="Times New Roman"/>
+          <w:sz w:val="28"/>
+          <w:szCs w:val="28"/>
+        </w:rPr>
+        <w:t>— extract 1×N, N×1, or submatrix views (as new matrices).</w:t>
       </w:r>
     </w:p>
     <w:p>
@@ -5499,6 +5983,7 @@
           <w:sz w:val="28"/>
           <w:szCs w:val="28"/>
         </w:rPr>
+        <w:lastRenderedPageBreak/>
         <w:t xml:space="preserve">Scalar operations: </w:t>
       </w:r>
       <w:proofErr w:type="spellStart"/>
@@ -5583,7 +6068,6 @@
           <w:sz w:val="28"/>
           <w:szCs w:val="28"/>
         </w:rPr>
-        <w:lastRenderedPageBreak/>
         <w:pict w14:anchorId="15CF4B41">
           <v:rect id="_x0000_i1028" style="width:0;height:1.5pt" o:hralign="center" o:hrstd="t" o:hr="t" fillcolor="#a0a0a0" stroked="f"/>
         </w:pict>
@@ -5679,13 +6163,39 @@
       <w:proofErr w:type="spellStart"/>
       <w:r>
         <w:rPr>
-          <w:rFonts w:ascii="Times New Roman" w:hAnsi="Times New Roman" w:cs="Times New Roman"/>
-          <w:sz w:val="28"/>
-          <w:szCs w:val="28"/>
-        </w:rPr>
-        <w:t>multiply_matrix</w:t>
+          <w:rFonts w:ascii="Consolas" w:hAnsi="Consolas" w:cs="Times New Roman"/>
+          <w:sz w:val="26"/>
+          <w:szCs w:val="26"/>
+        </w:rPr>
+        <w:t>multiply_</w:t>
+      </w:r>
+      <w:proofErr w:type="gramStart"/>
+      <w:r>
+        <w:rPr>
+          <w:rFonts w:ascii="Consolas" w:hAnsi="Consolas" w:cs="Times New Roman"/>
+          <w:sz w:val="26"/>
+          <w:szCs w:val="26"/>
+        </w:rPr>
+        <w:t>matrix</w:t>
       </w:r>
       <w:proofErr w:type="spellEnd"/>
+      <w:r>
+        <w:rPr>
+          <w:rFonts w:ascii="Consolas" w:hAnsi="Consolas" w:cs="Times New Roman"/>
+          <w:sz w:val="26"/>
+          <w:szCs w:val="26"/>
+        </w:rPr>
+        <w:t>(</w:t>
+      </w:r>
+      <w:proofErr w:type="gramEnd"/>
+      <w:r>
+        <w:rPr>
+          <w:rFonts w:ascii="Consolas" w:hAnsi="Consolas" w:cs="Times New Roman"/>
+          <w:sz w:val="26"/>
+          <w:szCs w:val="26"/>
+        </w:rPr>
+        <w:t>)</w:t>
+      </w:r>
       <w:r>
         <w:rPr>
           <w:rFonts w:ascii="Times New Roman" w:hAnsi="Times New Roman" w:cs="Times New Roman"/>
@@ -5738,13 +6248,39 @@
       <w:proofErr w:type="spellStart"/>
       <w:r>
         <w:rPr>
-          <w:rFonts w:ascii="Times New Roman" w:hAnsi="Times New Roman" w:cs="Times New Roman"/>
-          <w:sz w:val="28"/>
-          <w:szCs w:val="28"/>
-        </w:rPr>
-        <w:t>dot_product</w:t>
+          <w:rFonts w:ascii="Consolas" w:hAnsi="Consolas" w:cs="Times New Roman"/>
+          <w:sz w:val="26"/>
+          <w:szCs w:val="26"/>
+        </w:rPr>
+        <w:t>dot_</w:t>
+      </w:r>
+      <w:proofErr w:type="gramStart"/>
+      <w:r>
+        <w:rPr>
+          <w:rFonts w:ascii="Consolas" w:hAnsi="Consolas" w:cs="Times New Roman"/>
+          <w:sz w:val="26"/>
+          <w:szCs w:val="26"/>
+        </w:rPr>
+        <w:t>product</w:t>
       </w:r>
       <w:proofErr w:type="spellEnd"/>
+      <w:r>
+        <w:rPr>
+          <w:rFonts w:ascii="Consolas" w:hAnsi="Consolas" w:cs="Times New Roman"/>
+          <w:sz w:val="26"/>
+          <w:szCs w:val="26"/>
+        </w:rPr>
+        <w:t>(</w:t>
+      </w:r>
+      <w:proofErr w:type="gramEnd"/>
+      <w:r>
+        <w:rPr>
+          <w:rFonts w:ascii="Consolas" w:hAnsi="Consolas" w:cs="Times New Roman"/>
+          <w:sz w:val="26"/>
+          <w:szCs w:val="26"/>
+        </w:rPr>
+        <w:t>)</w:t>
+      </w:r>
       <w:r>
         <w:rPr>
           <w:rFonts w:ascii="Times New Roman" w:hAnsi="Times New Roman" w:cs="Times New Roman"/>
@@ -5779,13 +6315,39 @@
       <w:proofErr w:type="spellStart"/>
       <w:r>
         <w:rPr>
-          <w:rFonts w:ascii="Times New Roman" w:hAnsi="Times New Roman" w:cs="Times New Roman"/>
-          <w:sz w:val="28"/>
-          <w:szCs w:val="28"/>
-        </w:rPr>
-        <w:t>transpose_matrix</w:t>
+          <w:rFonts w:ascii="Consolas" w:hAnsi="Consolas" w:cs="Times New Roman"/>
+          <w:sz w:val="26"/>
+          <w:szCs w:val="26"/>
+        </w:rPr>
+        <w:t>transpose_</w:t>
+      </w:r>
+      <w:proofErr w:type="gramStart"/>
+      <w:r>
+        <w:rPr>
+          <w:rFonts w:ascii="Consolas" w:hAnsi="Consolas" w:cs="Times New Roman"/>
+          <w:sz w:val="26"/>
+          <w:szCs w:val="26"/>
+        </w:rPr>
+        <w:t>matrix</w:t>
       </w:r>
       <w:proofErr w:type="spellEnd"/>
+      <w:r>
+        <w:rPr>
+          <w:rFonts w:ascii="Consolas" w:hAnsi="Consolas" w:cs="Times New Roman"/>
+          <w:sz w:val="26"/>
+          <w:szCs w:val="26"/>
+        </w:rPr>
+        <w:t>(</w:t>
+      </w:r>
+      <w:proofErr w:type="gramEnd"/>
+      <w:r>
+        <w:rPr>
+          <w:rFonts w:ascii="Consolas" w:hAnsi="Consolas" w:cs="Times New Roman"/>
+          <w:sz w:val="26"/>
+          <w:szCs w:val="26"/>
+        </w:rPr>
+        <w:t>)</w:t>
+      </w:r>
       <w:r>
         <w:rPr>
           <w:rFonts w:ascii="Times New Roman" w:hAnsi="Times New Roman" w:cs="Times New Roman"/>
@@ -5820,15 +6382,41 @@
       <w:proofErr w:type="spellStart"/>
       <w:r>
         <w:rPr>
-          <w:rFonts w:ascii="Times New Roman" w:hAnsi="Times New Roman" w:cs="Times New Roman"/>
-          <w:sz w:val="28"/>
-          <w:szCs w:val="28"/>
-        </w:rPr>
-        <w:t>determinant_matrix</w:t>
+          <w:rFonts w:ascii="Consolas" w:hAnsi="Consolas" w:cs="Times New Roman"/>
+          <w:sz w:val="26"/>
+          <w:szCs w:val="26"/>
+        </w:rPr>
+        <w:t>determinant_</w:t>
+      </w:r>
+      <w:proofErr w:type="gramStart"/>
+      <w:r>
+        <w:rPr>
+          <w:rFonts w:ascii="Consolas" w:hAnsi="Consolas" w:cs="Times New Roman"/>
+          <w:sz w:val="26"/>
+          <w:szCs w:val="26"/>
+        </w:rPr>
+        <w:t>matrix</w:t>
       </w:r>
       <w:proofErr w:type="spellEnd"/>
       <w:r>
         <w:rPr>
+          <w:rFonts w:ascii="Consolas" w:hAnsi="Consolas" w:cs="Times New Roman"/>
+          <w:sz w:val="26"/>
+          <w:szCs w:val="26"/>
+        </w:rPr>
+        <w:t>(</w:t>
+      </w:r>
+      <w:proofErr w:type="gramEnd"/>
+      <w:r>
+        <w:rPr>
+          <w:rFonts w:ascii="Consolas" w:hAnsi="Consolas" w:cs="Times New Roman"/>
+          <w:sz w:val="26"/>
+          <w:szCs w:val="26"/>
+        </w:rPr>
+        <w:t>)</w:t>
+      </w:r>
+      <w:r>
+        <w:rPr>
           <w:rFonts w:ascii="Times New Roman" w:hAnsi="Times New Roman" w:cs="Times New Roman"/>
           <w:sz w:val="28"/>
           <w:szCs w:val="28"/>
@@ -5838,15 +6426,41 @@
       <w:proofErr w:type="spellStart"/>
       <w:r>
         <w:rPr>
-          <w:rFonts w:ascii="Times New Roman" w:hAnsi="Times New Roman" w:cs="Times New Roman"/>
-          <w:sz w:val="28"/>
-          <w:szCs w:val="28"/>
-        </w:rPr>
-        <w:t>inverse_matrix</w:t>
+          <w:rFonts w:ascii="Consolas" w:hAnsi="Consolas" w:cs="Times New Roman"/>
+          <w:sz w:val="26"/>
+          <w:szCs w:val="26"/>
+        </w:rPr>
+        <w:t>inverse_</w:t>
+      </w:r>
+      <w:proofErr w:type="gramStart"/>
+      <w:r>
+        <w:rPr>
+          <w:rFonts w:ascii="Consolas" w:hAnsi="Consolas" w:cs="Times New Roman"/>
+          <w:sz w:val="26"/>
+          <w:szCs w:val="26"/>
+        </w:rPr>
+        <w:t>matrix</w:t>
       </w:r>
       <w:proofErr w:type="spellEnd"/>
       <w:r>
         <w:rPr>
+          <w:rFonts w:ascii="Consolas" w:hAnsi="Consolas" w:cs="Times New Roman"/>
+          <w:sz w:val="26"/>
+          <w:szCs w:val="26"/>
+        </w:rPr>
+        <w:t>(</w:t>
+      </w:r>
+      <w:proofErr w:type="gramEnd"/>
+      <w:r>
+        <w:rPr>
+          <w:rFonts w:ascii="Consolas" w:hAnsi="Consolas" w:cs="Times New Roman"/>
+          <w:sz w:val="26"/>
+          <w:szCs w:val="26"/>
+        </w:rPr>
+        <w:t>)</w:t>
+      </w:r>
+      <w:r>
+        <w:rPr>
           <w:rFonts w:ascii="Times New Roman" w:hAnsi="Times New Roman" w:cs="Times New Roman"/>
           <w:sz w:val="28"/>
           <w:szCs w:val="28"/>
@@ -5856,15 +6470,41 @@
       <w:proofErr w:type="spellStart"/>
       <w:r>
         <w:rPr>
-          <w:rFonts w:ascii="Times New Roman" w:hAnsi="Times New Roman" w:cs="Times New Roman"/>
-          <w:sz w:val="28"/>
-          <w:szCs w:val="28"/>
-        </w:rPr>
-        <w:t>cofactor_matrix</w:t>
+          <w:rFonts w:ascii="Consolas" w:hAnsi="Consolas" w:cs="Times New Roman"/>
+          <w:sz w:val="26"/>
+          <w:szCs w:val="26"/>
+        </w:rPr>
+        <w:t>cofactor_</w:t>
+      </w:r>
+      <w:proofErr w:type="gramStart"/>
+      <w:r>
+        <w:rPr>
+          <w:rFonts w:ascii="Consolas" w:hAnsi="Consolas" w:cs="Times New Roman"/>
+          <w:sz w:val="26"/>
+          <w:szCs w:val="26"/>
+        </w:rPr>
+        <w:t>matrix</w:t>
       </w:r>
       <w:proofErr w:type="spellEnd"/>
       <w:r>
         <w:rPr>
+          <w:rFonts w:ascii="Consolas" w:hAnsi="Consolas" w:cs="Times New Roman"/>
+          <w:sz w:val="26"/>
+          <w:szCs w:val="26"/>
+        </w:rPr>
+        <w:t>(</w:t>
+      </w:r>
+      <w:proofErr w:type="gramEnd"/>
+      <w:r>
+        <w:rPr>
+          <w:rFonts w:ascii="Consolas" w:hAnsi="Consolas" w:cs="Times New Roman"/>
+          <w:sz w:val="26"/>
+          <w:szCs w:val="26"/>
+        </w:rPr>
+        <w:t>)</w:t>
+      </w:r>
+      <w:r>
+        <w:rPr>
           <w:rFonts w:ascii="Times New Roman" w:hAnsi="Times New Roman" w:cs="Times New Roman"/>
           <w:sz w:val="28"/>
           <w:szCs w:val="28"/>
@@ -5874,15 +6514,41 @@
       <w:proofErr w:type="spellStart"/>
       <w:r>
         <w:rPr>
-          <w:rFonts w:ascii="Times New Roman" w:hAnsi="Times New Roman" w:cs="Times New Roman"/>
-          <w:sz w:val="28"/>
-          <w:szCs w:val="28"/>
-        </w:rPr>
-        <w:t>adjoint_matrix</w:t>
+          <w:rFonts w:ascii="Consolas" w:hAnsi="Consolas" w:cs="Times New Roman"/>
+          <w:sz w:val="26"/>
+          <w:szCs w:val="26"/>
+        </w:rPr>
+        <w:t>adjoint_</w:t>
+      </w:r>
+      <w:proofErr w:type="gramStart"/>
+      <w:r>
+        <w:rPr>
+          <w:rFonts w:ascii="Consolas" w:hAnsi="Consolas" w:cs="Times New Roman"/>
+          <w:sz w:val="26"/>
+          <w:szCs w:val="26"/>
+        </w:rPr>
+        <w:t>matrix</w:t>
       </w:r>
       <w:proofErr w:type="spellEnd"/>
       <w:r>
         <w:rPr>
+          <w:rFonts w:ascii="Consolas" w:hAnsi="Consolas" w:cs="Times New Roman"/>
+          <w:sz w:val="26"/>
+          <w:szCs w:val="26"/>
+        </w:rPr>
+        <w:t>(</w:t>
+      </w:r>
+      <w:proofErr w:type="gramEnd"/>
+      <w:r>
+        <w:rPr>
+          <w:rFonts w:ascii="Consolas" w:hAnsi="Consolas" w:cs="Times New Roman"/>
+          <w:sz w:val="26"/>
+          <w:szCs w:val="26"/>
+        </w:rPr>
+        <w:t>)</w:t>
+      </w:r>
+      <w:r>
+        <w:rPr>
           <w:rFonts w:ascii="Times New Roman" w:hAnsi="Times New Roman" w:cs="Times New Roman"/>
           <w:sz w:val="28"/>
           <w:szCs w:val="28"/>
@@ -5892,13 +6558,39 @@
       <w:proofErr w:type="spellStart"/>
       <w:r>
         <w:rPr>
-          <w:rFonts w:ascii="Times New Roman" w:hAnsi="Times New Roman" w:cs="Times New Roman"/>
-          <w:sz w:val="28"/>
-          <w:szCs w:val="28"/>
-        </w:rPr>
-        <w:t>minor_matrix</w:t>
+          <w:rFonts w:ascii="Consolas" w:hAnsi="Consolas" w:cs="Times New Roman"/>
+          <w:sz w:val="26"/>
+          <w:szCs w:val="26"/>
+        </w:rPr>
+        <w:t>minor_</w:t>
+      </w:r>
+      <w:proofErr w:type="gramStart"/>
+      <w:r>
+        <w:rPr>
+          <w:rFonts w:ascii="Consolas" w:hAnsi="Consolas" w:cs="Times New Roman"/>
+          <w:sz w:val="26"/>
+          <w:szCs w:val="26"/>
+        </w:rPr>
+        <w:t>matrix</w:t>
       </w:r>
       <w:proofErr w:type="spellEnd"/>
+      <w:r>
+        <w:rPr>
+          <w:rFonts w:ascii="Consolas" w:hAnsi="Consolas" w:cs="Times New Roman"/>
+          <w:sz w:val="26"/>
+          <w:szCs w:val="26"/>
+        </w:rPr>
+        <w:t>(</w:t>
+      </w:r>
+      <w:proofErr w:type="gramEnd"/>
+      <w:r>
+        <w:rPr>
+          <w:rFonts w:ascii="Consolas" w:hAnsi="Consolas" w:cs="Times New Roman"/>
+          <w:sz w:val="26"/>
+          <w:szCs w:val="26"/>
+        </w:rPr>
+        <w:t>)</w:t>
+      </w:r>
       <w:r>
         <w:rPr>
           <w:rFonts w:ascii="Times New Roman" w:hAnsi="Times New Roman" w:cs="Times New Roman"/>
@@ -5933,15 +6625,41 @@
       <w:proofErr w:type="spellStart"/>
       <w:r>
         <w:rPr>
-          <w:rFonts w:ascii="Times New Roman" w:hAnsi="Times New Roman" w:cs="Times New Roman"/>
-          <w:sz w:val="28"/>
-          <w:szCs w:val="28"/>
-        </w:rPr>
-        <w:t>swap_rows</w:t>
+          <w:rFonts w:ascii="Consolas" w:hAnsi="Consolas" w:cs="Times New Roman"/>
+          <w:sz w:val="26"/>
+          <w:szCs w:val="26"/>
+        </w:rPr>
+        <w:t>swap_</w:t>
+      </w:r>
+      <w:proofErr w:type="gramStart"/>
+      <w:r>
+        <w:rPr>
+          <w:rFonts w:ascii="Consolas" w:hAnsi="Consolas" w:cs="Times New Roman"/>
+          <w:sz w:val="26"/>
+          <w:szCs w:val="26"/>
+        </w:rPr>
+        <w:t>rows</w:t>
       </w:r>
       <w:proofErr w:type="spellEnd"/>
       <w:r>
         <w:rPr>
+          <w:rFonts w:ascii="Consolas" w:hAnsi="Consolas" w:cs="Times New Roman"/>
+          <w:sz w:val="26"/>
+          <w:szCs w:val="26"/>
+        </w:rPr>
+        <w:t>(</w:t>
+      </w:r>
+      <w:proofErr w:type="gramEnd"/>
+      <w:r>
+        <w:rPr>
+          <w:rFonts w:ascii="Consolas" w:hAnsi="Consolas" w:cs="Times New Roman"/>
+          <w:sz w:val="26"/>
+          <w:szCs w:val="26"/>
+        </w:rPr>
+        <w:t>)</w:t>
+      </w:r>
+      <w:r>
+        <w:rPr>
           <w:rFonts w:ascii="Times New Roman" w:hAnsi="Times New Roman" w:cs="Times New Roman"/>
           <w:sz w:val="28"/>
           <w:szCs w:val="28"/>
@@ -5951,15 +6669,41 @@
       <w:proofErr w:type="spellStart"/>
       <w:r>
         <w:rPr>
-          <w:rFonts w:ascii="Times New Roman" w:hAnsi="Times New Roman" w:cs="Times New Roman"/>
-          <w:sz w:val="28"/>
-          <w:szCs w:val="28"/>
-        </w:rPr>
-        <w:t>add_rows</w:t>
+          <w:rFonts w:ascii="Consolas" w:hAnsi="Consolas" w:cs="Times New Roman"/>
+          <w:sz w:val="26"/>
+          <w:szCs w:val="26"/>
+        </w:rPr>
+        <w:t>add_</w:t>
+      </w:r>
+      <w:proofErr w:type="gramStart"/>
+      <w:r>
+        <w:rPr>
+          <w:rFonts w:ascii="Consolas" w:hAnsi="Consolas" w:cs="Times New Roman"/>
+          <w:sz w:val="26"/>
+          <w:szCs w:val="26"/>
+        </w:rPr>
+        <w:t>rows</w:t>
       </w:r>
       <w:proofErr w:type="spellEnd"/>
       <w:r>
         <w:rPr>
+          <w:rFonts w:ascii="Consolas" w:hAnsi="Consolas" w:cs="Times New Roman"/>
+          <w:sz w:val="26"/>
+          <w:szCs w:val="26"/>
+        </w:rPr>
+        <w:t>(</w:t>
+      </w:r>
+      <w:proofErr w:type="gramEnd"/>
+      <w:r>
+        <w:rPr>
+          <w:rFonts w:ascii="Consolas" w:hAnsi="Consolas" w:cs="Times New Roman"/>
+          <w:sz w:val="26"/>
+          <w:szCs w:val="26"/>
+        </w:rPr>
+        <w:t>)</w:t>
+      </w:r>
+      <w:r>
+        <w:rPr>
           <w:rFonts w:ascii="Times New Roman" w:hAnsi="Times New Roman" w:cs="Times New Roman"/>
           <w:sz w:val="28"/>
           <w:szCs w:val="28"/>
@@ -5969,13 +6713,39 @@
       <w:proofErr w:type="spellStart"/>
       <w:r>
         <w:rPr>
-          <w:rFonts w:ascii="Times New Roman" w:hAnsi="Times New Roman" w:cs="Times New Roman"/>
-          <w:sz w:val="28"/>
-          <w:szCs w:val="28"/>
-        </w:rPr>
-        <w:t>multiply_row</w:t>
+          <w:rFonts w:ascii="Consolas" w:hAnsi="Consolas" w:cs="Times New Roman"/>
+          <w:sz w:val="26"/>
+          <w:szCs w:val="26"/>
+        </w:rPr>
+        <w:t>multiply_</w:t>
+      </w:r>
+      <w:proofErr w:type="gramStart"/>
+      <w:r>
+        <w:rPr>
+          <w:rFonts w:ascii="Consolas" w:hAnsi="Consolas" w:cs="Times New Roman"/>
+          <w:sz w:val="26"/>
+          <w:szCs w:val="26"/>
+        </w:rPr>
+        <w:t>row</w:t>
       </w:r>
       <w:proofErr w:type="spellEnd"/>
+      <w:r>
+        <w:rPr>
+          <w:rFonts w:ascii="Consolas" w:hAnsi="Consolas" w:cs="Times New Roman"/>
+          <w:sz w:val="26"/>
+          <w:szCs w:val="26"/>
+        </w:rPr>
+        <w:t>(</w:t>
+      </w:r>
+      <w:proofErr w:type="gramEnd"/>
+      <w:r>
+        <w:rPr>
+          <w:rFonts w:ascii="Consolas" w:hAnsi="Consolas" w:cs="Times New Roman"/>
+          <w:sz w:val="26"/>
+          <w:szCs w:val="26"/>
+        </w:rPr>
+        <w:t>)</w:t>
+      </w:r>
       <w:r>
         <w:rPr>
           <w:rFonts w:ascii="Times New Roman" w:hAnsi="Times New Roman" w:cs="Times New Roman"/>
@@ -6094,7 +6864,7 @@
     <w:p>
       <w:pPr>
         <w:pStyle w:val="ListParagraph"/>
-        <w:ind w:left="840"/>
+        <w:ind w:left="2160"/>
         <w:jc w:val="both"/>
         <w:rPr>
           <w:rFonts w:ascii="Times New Roman" w:hAnsi="Times New Roman" w:cs="Times New Roman"/>
@@ -6124,18 +6894,86 @@
           <w:sz w:val="28"/>
           <w:szCs w:val="28"/>
         </w:rPr>
-        <w:t xml:space="preserve">elementwise transforms: apply_function, </w:t>
+        <w:t xml:space="preserve">elementwise transforms: </w:t>
+      </w:r>
+      <w:r>
+        <w:rPr>
+          <w:rFonts w:ascii="Consolas" w:hAnsi="Consolas" w:cs="Times New Roman"/>
+          <w:sz w:val="26"/>
+          <w:szCs w:val="26"/>
+        </w:rPr>
+        <w:t>apply_</w:t>
+      </w:r>
+      <w:proofErr w:type="gramStart"/>
+      <w:r>
+        <w:rPr>
+          <w:rFonts w:ascii="Consolas" w:hAnsi="Consolas" w:cs="Times New Roman"/>
+          <w:sz w:val="26"/>
+          <w:szCs w:val="26"/>
+        </w:rPr>
+        <w:t>function</w:t>
+      </w:r>
+      <w:r>
+        <w:rPr>
+          <w:rFonts w:ascii="Consolas" w:hAnsi="Consolas" w:cs="Times New Roman"/>
+          <w:sz w:val="26"/>
+          <w:szCs w:val="26"/>
+        </w:rPr>
+        <w:t>(</w:t>
+      </w:r>
+      <w:proofErr w:type="gramEnd"/>
+      <w:r>
+        <w:rPr>
+          <w:rFonts w:ascii="Consolas" w:hAnsi="Consolas" w:cs="Times New Roman"/>
+          <w:sz w:val="26"/>
+          <w:szCs w:val="26"/>
+        </w:rPr>
+        <w:t>)</w:t>
+      </w:r>
+      <w:r>
+        <w:rPr>
+          <w:rFonts w:ascii="Consolas" w:hAnsi="Consolas" w:cs="Times New Roman"/>
+          <w:sz w:val="26"/>
+          <w:szCs w:val="26"/>
+        </w:rPr>
+        <w:t xml:space="preserve">, </w:t>
       </w:r>
       <w:proofErr w:type="spellStart"/>
       <w:r>
         <w:rPr>
-          <w:rFonts w:ascii="Times New Roman" w:hAnsi="Times New Roman" w:cs="Times New Roman"/>
-          <w:sz w:val="28"/>
-          <w:szCs w:val="28"/>
-        </w:rPr>
-        <w:t>apply_function_inplace</w:t>
+          <w:rFonts w:ascii="Consolas" w:hAnsi="Consolas" w:cs="Times New Roman"/>
+          <w:sz w:val="26"/>
+          <w:szCs w:val="26"/>
+        </w:rPr>
+        <w:t>apply_function_</w:t>
+      </w:r>
+      <w:proofErr w:type="gramStart"/>
+      <w:r>
+        <w:rPr>
+          <w:rFonts w:ascii="Consolas" w:hAnsi="Consolas" w:cs="Times New Roman"/>
+          <w:sz w:val="26"/>
+          <w:szCs w:val="26"/>
+        </w:rPr>
+        <w:t>inplace</w:t>
       </w:r>
       <w:proofErr w:type="spellEnd"/>
+      <w:r>
+        <w:rPr>
+          <w:rFonts w:ascii="Consolas" w:hAnsi="Consolas" w:cs="Times New Roman"/>
+          <w:sz w:val="26"/>
+          <w:szCs w:val="26"/>
+        </w:rPr>
+        <w:t>(</w:t>
+      </w:r>
+      <w:proofErr w:type="gramEnd"/>
+      <w:r>
+        <w:rPr>
+          <w:rFonts w:ascii="Consolas" w:hAnsi="Consolas" w:cs="Times New Roman"/>
+          <w:sz w:val="26"/>
+          <w:szCs w:val="26"/>
+        </w:rPr>
+        <w:t>)</w:t>
+      </w:r>
       <w:r>
         <w:rPr>
           <w:rFonts w:ascii="Times New Roman" w:hAnsi="Times New Roman" w:cs="Times New Roman"/>
@@ -6198,36 +7036,89 @@
           <w:sz w:val="28"/>
           <w:szCs w:val="28"/>
         </w:rPr>
+        <w:lastRenderedPageBreak/>
         <w:t xml:space="preserve">Broadcasting: </w:t>
       </w:r>
       <w:proofErr w:type="spellStart"/>
       <w:r>
         <w:rPr>
-          <w:rFonts w:ascii="Times New Roman" w:hAnsi="Times New Roman" w:cs="Times New Roman"/>
-          <w:sz w:val="28"/>
-          <w:szCs w:val="28"/>
-        </w:rPr>
-        <w:t>broadcast_add</w:t>
+          <w:rFonts w:ascii="Consolas" w:hAnsi="Consolas" w:cs="Times New Roman"/>
+          <w:sz w:val="26"/>
+          <w:szCs w:val="26"/>
+        </w:rPr>
+        <w:t>broadcast_</w:t>
+      </w:r>
+      <w:proofErr w:type="gramStart"/>
+      <w:r>
+        <w:rPr>
+          <w:rFonts w:ascii="Consolas" w:hAnsi="Consolas" w:cs="Times New Roman"/>
+          <w:sz w:val="26"/>
+          <w:szCs w:val="26"/>
+        </w:rPr>
+        <w:t>add</w:t>
       </w:r>
       <w:proofErr w:type="spellEnd"/>
       <w:r>
         <w:rPr>
-          <w:rFonts w:ascii="Times New Roman" w:hAnsi="Times New Roman" w:cs="Times New Roman"/>
-          <w:sz w:val="28"/>
-          <w:szCs w:val="28"/>
+          <w:rFonts w:ascii="Consolas" w:hAnsi="Consolas" w:cs="Times New Roman"/>
+          <w:sz w:val="26"/>
+          <w:szCs w:val="26"/>
+        </w:rPr>
+        <w:t>(</w:t>
+      </w:r>
+      <w:proofErr w:type="gramEnd"/>
+      <w:r>
+        <w:rPr>
+          <w:rFonts w:ascii="Consolas" w:hAnsi="Consolas" w:cs="Times New Roman"/>
+          <w:sz w:val="26"/>
+          <w:szCs w:val="26"/>
+        </w:rPr>
+        <w:t>)</w:t>
+      </w:r>
+      <w:r>
+        <w:rPr>
+          <w:rFonts w:ascii="Consolas" w:hAnsi="Consolas" w:cs="Times New Roman"/>
+          <w:sz w:val="26"/>
+          <w:szCs w:val="26"/>
         </w:rPr>
         <w:t xml:space="preserve">, </w:t>
       </w:r>
       <w:proofErr w:type="spellStart"/>
       <w:r>
         <w:rPr>
-          <w:rFonts w:ascii="Times New Roman" w:hAnsi="Times New Roman" w:cs="Times New Roman"/>
-          <w:sz w:val="28"/>
-          <w:szCs w:val="28"/>
-        </w:rPr>
-        <w:t>broadcast_add_inplace</w:t>
+          <w:rFonts w:ascii="Consolas" w:hAnsi="Consolas" w:cs="Times New Roman"/>
+          <w:sz w:val="26"/>
+          <w:szCs w:val="26"/>
+        </w:rPr>
+        <w:t>broadcast_add_</w:t>
+      </w:r>
+      <w:proofErr w:type="gramStart"/>
+      <w:r>
+        <w:rPr>
+          <w:rFonts w:ascii="Consolas" w:hAnsi="Consolas" w:cs="Times New Roman"/>
+          <w:sz w:val="26"/>
+          <w:szCs w:val="26"/>
+        </w:rPr>
+        <w:t>inplace</w:t>
       </w:r>
       <w:proofErr w:type="spellEnd"/>
+      <w:r>
+        <w:rPr>
+          <w:rFonts w:ascii="Consolas" w:hAnsi="Consolas" w:cs="Times New Roman"/>
+          <w:sz w:val="26"/>
+          <w:szCs w:val="26"/>
+        </w:rPr>
+        <w:t>(</w:t>
+      </w:r>
+      <w:proofErr w:type="gramEnd"/>
+      <w:r>
+        <w:rPr>
+          <w:rFonts w:ascii="Consolas" w:hAnsi="Consolas" w:cs="Times New Roman"/>
+          <w:sz w:val="26"/>
+          <w:szCs w:val="26"/>
+        </w:rPr>
+        <w:t>)</w:t>
+      </w:r>
       <w:r>
         <w:rPr>
           <w:rFonts w:ascii="Times New Roman" w:hAnsi="Times New Roman" w:cs="Times New Roman"/>
@@ -6254,19 +7145,44 @@
           <w:sz w:val="28"/>
           <w:szCs w:val="28"/>
         </w:rPr>
-        <w:lastRenderedPageBreak/>
         <w:t xml:space="preserve">Selection &amp; initialization: argmax returns the index of the largest element, and </w:t>
       </w:r>
       <w:proofErr w:type="spellStart"/>
       <w:r>
         <w:rPr>
-          <w:rFonts w:ascii="Times New Roman" w:hAnsi="Times New Roman" w:cs="Times New Roman"/>
-          <w:sz w:val="28"/>
-          <w:szCs w:val="28"/>
-        </w:rPr>
-        <w:t>normal_rand</w:t>
+          <w:rFonts w:ascii="Consolas" w:hAnsi="Consolas" w:cs="Times New Roman"/>
+          <w:sz w:val="26"/>
+          <w:szCs w:val="26"/>
+        </w:rPr>
+        <w:t>normal_</w:t>
+      </w:r>
+      <w:proofErr w:type="gramStart"/>
+      <w:r>
+        <w:rPr>
+          <w:rFonts w:ascii="Consolas" w:hAnsi="Consolas" w:cs="Times New Roman"/>
+          <w:sz w:val="26"/>
+          <w:szCs w:val="26"/>
+        </w:rPr>
+        <w:t>rand</w:t>
       </w:r>
       <w:proofErr w:type="spellEnd"/>
+      <w:r>
+        <w:rPr>
+          <w:rFonts w:ascii="Consolas" w:hAnsi="Consolas" w:cs="Times New Roman"/>
+          <w:sz w:val="26"/>
+          <w:szCs w:val="26"/>
+        </w:rPr>
+        <w:t>(</w:t>
+      </w:r>
+      <w:proofErr w:type="gramEnd"/>
+      <w:r>
+        <w:rPr>
+          <w:rFonts w:ascii="Consolas" w:hAnsi="Consolas" w:cs="Times New Roman"/>
+          <w:sz w:val="26"/>
+          <w:szCs w:val="26"/>
+        </w:rPr>
+        <w:t>)</w:t>
+      </w:r>
       <w:r>
         <w:rPr>
           <w:rFonts w:ascii="Times New Roman" w:hAnsi="Times New Roman" w:cs="Times New Roman"/>
@@ -6693,25 +7609,101 @@
           <w:sz w:val="28"/>
           <w:szCs w:val="28"/>
         </w:rPr>
-        <w:t xml:space="preserve">The API design mirrors common mathematical operations (e.g., add_matrix, </w:t>
+        <w:t xml:space="preserve">The API design mirrors common mathematical operations (e.g., </w:t>
+      </w:r>
+      <w:r>
+        <w:rPr>
+          <w:rFonts w:ascii="Consolas" w:hAnsi="Consolas" w:cs="Times New Roman"/>
+          <w:sz w:val="26"/>
+          <w:szCs w:val="26"/>
+        </w:rPr>
+        <w:t>add_</w:t>
+      </w:r>
+      <w:proofErr w:type="gramStart"/>
+      <w:r>
+        <w:rPr>
+          <w:rFonts w:ascii="Consolas" w:hAnsi="Consolas" w:cs="Times New Roman"/>
+          <w:sz w:val="26"/>
+          <w:szCs w:val="26"/>
+        </w:rPr>
+        <w:t>matrix</w:t>
+      </w:r>
+      <w:r>
+        <w:rPr>
+          <w:rFonts w:ascii="Consolas" w:hAnsi="Consolas" w:cs="Times New Roman"/>
+          <w:sz w:val="26"/>
+          <w:szCs w:val="26"/>
+        </w:rPr>
+        <w:t>(</w:t>
+      </w:r>
+      <w:proofErr w:type="gramEnd"/>
+      <w:r>
+        <w:rPr>
+          <w:rFonts w:ascii="Consolas" w:hAnsi="Consolas" w:cs="Times New Roman"/>
+          <w:sz w:val="26"/>
+          <w:szCs w:val="26"/>
+        </w:rPr>
+        <w:t>)</w:t>
+      </w:r>
+      <w:r>
+        <w:rPr>
+          <w:rFonts w:ascii="Consolas" w:hAnsi="Consolas" w:cs="Times New Roman"/>
+          <w:sz w:val="26"/>
+          <w:szCs w:val="26"/>
+        </w:rPr>
+        <w:t xml:space="preserve">, </w:t>
       </w:r>
       <w:proofErr w:type="spellStart"/>
       <w:r>
         <w:rPr>
-          <w:rFonts w:ascii="Times New Roman" w:hAnsi="Times New Roman" w:cs="Times New Roman"/>
-          <w:sz w:val="28"/>
-          <w:szCs w:val="28"/>
-        </w:rPr>
-        <w:t>multiply_matrix</w:t>
+          <w:rFonts w:ascii="Consolas" w:hAnsi="Consolas" w:cs="Times New Roman"/>
+          <w:sz w:val="26"/>
+          <w:szCs w:val="26"/>
+        </w:rPr>
+        <w:t>multiply_</w:t>
+      </w:r>
+      <w:proofErr w:type="gramStart"/>
+      <w:r>
+        <w:rPr>
+          <w:rFonts w:ascii="Consolas" w:hAnsi="Consolas" w:cs="Times New Roman"/>
+          <w:sz w:val="26"/>
+          <w:szCs w:val="26"/>
+        </w:rPr>
+        <w:t>matrix</w:t>
       </w:r>
       <w:proofErr w:type="spellEnd"/>
       <w:r>
         <w:rPr>
-          <w:rFonts w:ascii="Times New Roman" w:hAnsi="Times New Roman" w:cs="Times New Roman"/>
-          <w:sz w:val="28"/>
-          <w:szCs w:val="28"/>
-        </w:rPr>
-        <w:t xml:space="preserve">). A developer familiar with </w:t>
+          <w:rFonts w:ascii="Consolas" w:hAnsi="Consolas" w:cs="Times New Roman"/>
+          <w:sz w:val="26"/>
+          <w:szCs w:val="26"/>
+        </w:rPr>
+        <w:t>(</w:t>
+      </w:r>
+      <w:proofErr w:type="gramEnd"/>
+      <w:r>
+        <w:rPr>
+          <w:rFonts w:ascii="Consolas" w:hAnsi="Consolas" w:cs="Times New Roman"/>
+          <w:sz w:val="26"/>
+          <w:szCs w:val="26"/>
+        </w:rPr>
+        <w:t>)</w:t>
+      </w:r>
+      <w:r>
+        <w:rPr>
+          <w:rFonts w:ascii="Consolas" w:hAnsi="Consolas" w:cs="Times New Roman"/>
+          <w:sz w:val="26"/>
+          <w:szCs w:val="26"/>
+        </w:rPr>
+        <w:t xml:space="preserve">). </w:t>
+      </w:r>
+      <w:r>
+        <w:rPr>
+          <w:rFonts w:ascii="Times New Roman" w:hAnsi="Times New Roman" w:cs="Times New Roman"/>
+          <w:sz w:val="28"/>
+          <w:szCs w:val="28"/>
+        </w:rPr>
+        <w:t xml:space="preserve">A developer </w:t>
       </w:r>
       <w:r>
         <w:rPr>
@@ -6720,7 +7712,7 @@
           <w:szCs w:val="28"/>
         </w:rPr>
         <w:lastRenderedPageBreak/>
-        <w:t>mathematical notation or other libraries like NumPy will find the transition to CMML straightforward.</w:t>
+        <w:t>familiar with mathematical notation or other libraries like NumPy will find the transition to CMML straightforward.</w:t>
       </w:r>
     </w:p>
     <w:p>
@@ -11431,7 +12423,6 @@
     <w:p>
       <w:pPr>
         <w:spacing w:line="276" w:lineRule="auto"/>
-        <w:ind w:firstLine="720"/>
         <w:jc w:val="both"/>
         <w:rPr>
           <w:rFonts w:ascii="Consolas" w:hAnsi="Consolas" w:cs="Cascadia Code"/>
@@ -11442,6 +12433,17 @@
           <w:szCs w:val="32"/>
         </w:rPr>
       </w:pPr>
+      <w:r>
+        <w:rPr>
+          <w:rFonts w:ascii="Consolas" w:hAnsi="Consolas" w:cs="Cascadia Code"/>
+          <w:b/>
+          <w:bCs/>
+          <w:noProof/>
+          <w:sz w:val="32"/>
+          <w:szCs w:val="32"/>
+        </w:rPr>
+        <w:t xml:space="preserve">  </w:t>
+      </w:r>
       <w:r>
         <w:rPr>
           <w:rFonts w:ascii="Consolas" w:hAnsi="Consolas" w:cs="Cascadia Code"/>
@@ -14968,59 +15970,13 @@
                               </w:rPr>
                               <w:t>if (</w:t>
                             </w:r>
-                            <w:proofErr w:type="spellStart"/>
                             <w:r>
                               <w:rPr>
                                 <w:rFonts w:ascii="Courier New" w:hAnsi="Courier New" w:cs="Courier New"/>
                                 <w:b/>
                                 <w:color w:val="444444"/>
                               </w:rPr>
-                              <w:t>fabsf</w:t>
-                            </w:r>
-                            <w:proofErr w:type="spellEnd"/>
-                            <w:r>
-                              <w:rPr>
-                                <w:rFonts w:ascii="Courier New" w:hAnsi="Courier New" w:cs="Courier New"/>
-                                <w:b/>
-                                <w:color w:val="444444"/>
-                              </w:rPr>
-                              <w:t>(a-&gt;value[</w:t>
-                            </w:r>
-                            <w:proofErr w:type="spellStart"/>
-                            <w:r>
-                              <w:rPr>
-                                <w:rFonts w:ascii="Courier New" w:hAnsi="Courier New" w:cs="Courier New"/>
-                                <w:b/>
-                                <w:color w:val="444444"/>
-                              </w:rPr>
-                              <w:t>i</w:t>
-                            </w:r>
-                            <w:proofErr w:type="spellEnd"/>
-                            <w:r>
-                              <w:rPr>
-                                <w:rFonts w:ascii="Courier New" w:hAnsi="Courier New" w:cs="Courier New"/>
-                                <w:b/>
-                                <w:color w:val="444444"/>
-                              </w:rPr>
-                              <w:t>] - b-&gt;value[</w:t>
-                            </w:r>
-                            <w:proofErr w:type="spellStart"/>
-                            <w:r>
-                              <w:rPr>
-                                <w:rFonts w:ascii="Courier New" w:hAnsi="Courier New" w:cs="Courier New"/>
-                                <w:b/>
-                                <w:color w:val="444444"/>
-                              </w:rPr>
-                              <w:t>i</w:t>
-                            </w:r>
-                            <w:proofErr w:type="spellEnd"/>
-                            <w:r>
-                              <w:rPr>
-                                <w:rFonts w:ascii="Courier New" w:hAnsi="Courier New" w:cs="Courier New"/>
-                                <w:b/>
-                                <w:color w:val="444444"/>
-                              </w:rPr>
-                              <w:t>]) &gt; tolerance) {</w:t>
+                              <w:t>fabsf(a-&gt;value[i] - b-&gt;value[i]) &gt; tolerance) {</w:t>
                             </w:r>
                             <w:r>
                               <w:rPr>
@@ -15122,59 +16078,13 @@
                         </w:rPr>
                         <w:t>if (</w:t>
                       </w:r>
-                      <w:proofErr w:type="spellStart"/>
                       <w:r>
                         <w:rPr>
                           <w:rFonts w:ascii="Courier New" w:hAnsi="Courier New" w:cs="Courier New"/>
                           <w:b/>
                           <w:color w:val="444444"/>
                         </w:rPr>
-                        <w:t>fabsf</w:t>
-                      </w:r>
-                      <w:proofErr w:type="spellEnd"/>
-                      <w:r>
-                        <w:rPr>
-                          <w:rFonts w:ascii="Courier New" w:hAnsi="Courier New" w:cs="Courier New"/>
-                          <w:b/>
-                          <w:color w:val="444444"/>
-                        </w:rPr>
-                        <w:t>(a-&gt;value[</w:t>
-                      </w:r>
-                      <w:proofErr w:type="spellStart"/>
-                      <w:r>
-                        <w:rPr>
-                          <w:rFonts w:ascii="Courier New" w:hAnsi="Courier New" w:cs="Courier New"/>
-                          <w:b/>
-                          <w:color w:val="444444"/>
-                        </w:rPr>
-                        <w:t>i</w:t>
-                      </w:r>
-                      <w:proofErr w:type="spellEnd"/>
-                      <w:r>
-                        <w:rPr>
-                          <w:rFonts w:ascii="Courier New" w:hAnsi="Courier New" w:cs="Courier New"/>
-                          <w:b/>
-                          <w:color w:val="444444"/>
-                        </w:rPr>
-                        <w:t>] - b-&gt;value[</w:t>
-                      </w:r>
-                      <w:proofErr w:type="spellStart"/>
-                      <w:r>
-                        <w:rPr>
-                          <w:rFonts w:ascii="Courier New" w:hAnsi="Courier New" w:cs="Courier New"/>
-                          <w:b/>
-                          <w:color w:val="444444"/>
-                        </w:rPr>
-                        <w:t>i</w:t>
-                      </w:r>
-                      <w:proofErr w:type="spellEnd"/>
-                      <w:r>
-                        <w:rPr>
-                          <w:rFonts w:ascii="Courier New" w:hAnsi="Courier New" w:cs="Courier New"/>
-                          <w:b/>
-                          <w:color w:val="444444"/>
-                        </w:rPr>
-                        <w:t>]) &gt; tolerance) {</w:t>
+                        <w:t>fabsf(a-&gt;value[i] - b-&gt;value[i]) &gt; tolerance) {</w:t>
                       </w:r>
                       <w:r>
                         <w:rPr>
@@ -17505,7 +18415,6 @@
                               </w:rPr>
                               <w:t xml:space="preserve">for (int </w:t>
                             </w:r>
-                            <w:proofErr w:type="spellStart"/>
                             <w:r>
                               <w:rPr>
                                 <w:rFonts w:ascii="Courier New" w:hAnsi="Courier New" w:cs="Courier New"/>
@@ -17514,106 +18423,7 @@
                                 <w:sz w:val="22"/>
                                 <w:szCs w:val="22"/>
                               </w:rPr>
-                              <w:t>i</w:t>
-                            </w:r>
-                            <w:proofErr w:type="spellEnd"/>
-                            <w:r>
-                              <w:rPr>
-                                <w:rFonts w:ascii="Courier New" w:hAnsi="Courier New" w:cs="Courier New"/>
-                                <w:b/>
-                                <w:color w:val="444444"/>
-                                <w:sz w:val="22"/>
-                                <w:szCs w:val="22"/>
-                              </w:rPr>
-                              <w:t xml:space="preserve"> = </w:t>
-                            </w:r>
-                            <w:proofErr w:type="spellStart"/>
-                            <w:r>
-                              <w:rPr>
-                                <w:rFonts w:ascii="Courier New" w:hAnsi="Courier New" w:cs="Courier New"/>
-                                <w:b/>
-                                <w:color w:val="444444"/>
-                                <w:sz w:val="22"/>
-                                <w:szCs w:val="22"/>
-                              </w:rPr>
-                              <w:t>r_start</w:t>
-                            </w:r>
-                            <w:proofErr w:type="spellEnd"/>
-                            <w:r>
-                              <w:rPr>
-                                <w:rFonts w:ascii="Courier New" w:hAnsi="Courier New" w:cs="Courier New"/>
-                                <w:b/>
-                                <w:color w:val="444444"/>
-                                <w:sz w:val="22"/>
-                                <w:szCs w:val="22"/>
-                              </w:rPr>
-                              <w:t xml:space="preserve">; </w:t>
-                            </w:r>
-                            <w:proofErr w:type="spellStart"/>
-                            <w:r>
-                              <w:rPr>
-                                <w:rFonts w:ascii="Courier New" w:hAnsi="Courier New" w:cs="Courier New"/>
-                                <w:b/>
-                                <w:color w:val="444444"/>
-                                <w:sz w:val="22"/>
-                                <w:szCs w:val="22"/>
-                              </w:rPr>
-                              <w:t>i</w:t>
-                            </w:r>
-                            <w:proofErr w:type="spellEnd"/>
-                            <w:r>
-                              <w:rPr>
-                                <w:rFonts w:ascii="Courier New" w:hAnsi="Courier New" w:cs="Courier New"/>
-                                <w:b/>
-                                <w:color w:val="444444"/>
-                                <w:sz w:val="22"/>
-                                <w:szCs w:val="22"/>
-                              </w:rPr>
-                              <w:t xml:space="preserve"> &lt; </w:t>
-                            </w:r>
-                            <w:proofErr w:type="spellStart"/>
-                            <w:r>
-                              <w:rPr>
-                                <w:rFonts w:ascii="Courier New" w:hAnsi="Courier New" w:cs="Courier New"/>
-                                <w:b/>
-                                <w:color w:val="444444"/>
-                                <w:sz w:val="22"/>
-                                <w:szCs w:val="22"/>
-                              </w:rPr>
-                              <w:t>r_end</w:t>
-                            </w:r>
-                            <w:proofErr w:type="spellEnd"/>
-                            <w:r>
-                              <w:rPr>
-                                <w:rFonts w:ascii="Courier New" w:hAnsi="Courier New" w:cs="Courier New"/>
-                                <w:b/>
-                                <w:color w:val="444444"/>
-                                <w:sz w:val="22"/>
-                                <w:szCs w:val="22"/>
-                              </w:rPr>
-                              <w:t>; ++</w:t>
-                            </w:r>
-                            <w:proofErr w:type="spellStart"/>
-                            <w:r>
-                              <w:rPr>
-                                <w:rFonts w:ascii="Courier New" w:hAnsi="Courier New" w:cs="Courier New"/>
-                                <w:b/>
-                                <w:color w:val="444444"/>
-                                <w:sz w:val="22"/>
-                                <w:szCs w:val="22"/>
-                              </w:rPr>
-                              <w:t>i</w:t>
-                            </w:r>
-                            <w:proofErr w:type="spellEnd"/>
-                            <w:r>
-                              <w:rPr>
-                                <w:rFonts w:ascii="Courier New" w:hAnsi="Courier New" w:cs="Courier New"/>
-                                <w:b/>
-                                <w:color w:val="444444"/>
-                                <w:sz w:val="22"/>
-                                <w:szCs w:val="22"/>
-                              </w:rPr>
-                              <w:t>) {</w:t>
+                              <w:t>i = r_start; i &lt; r_end; ++i) {</w:t>
                             </w:r>
                             <w:r>
                               <w:rPr>
@@ -17656,7 +18466,6 @@
                               <w:br/>
                               <w:t xml:space="preserve">    </w:t>
                             </w:r>
-                            <w:proofErr w:type="spellStart"/>
                             <w:r>
                               <w:rPr>
                                 <w:rFonts w:ascii="Courier New" w:hAnsi="Courier New" w:cs="Courier New"/>
@@ -17667,7 +18476,6 @@
                               </w:rPr>
                               <w:t>memcpy</w:t>
                             </w:r>
-                            <w:proofErr w:type="spellEnd"/>
                             <w:r>
                               <w:rPr>
                                 <w:rFonts w:ascii="Courier New" w:hAnsi="Courier New" w:cs="Courier New"/>
@@ -17676,51 +18484,7 @@
                                 <w:sz w:val="22"/>
                                 <w:szCs w:val="22"/>
                               </w:rPr>
-                              <w:t>(&amp;s-&gt;value[(</w:t>
-                            </w:r>
-                            <w:proofErr w:type="spellStart"/>
-                            <w:r>
-                              <w:rPr>
-                                <w:rFonts w:ascii="Courier New" w:hAnsi="Courier New" w:cs="Courier New"/>
-                                <w:b/>
-                                <w:color w:val="444444"/>
-                                <w:sz w:val="22"/>
-                                <w:szCs w:val="22"/>
-                              </w:rPr>
-                              <w:t>i</w:t>
-                            </w:r>
-                            <w:proofErr w:type="spellEnd"/>
-                            <w:r>
-                              <w:rPr>
-                                <w:rFonts w:ascii="Courier New" w:hAnsi="Courier New" w:cs="Courier New"/>
-                                <w:b/>
-                                <w:color w:val="444444"/>
-                                <w:sz w:val="22"/>
-                                <w:szCs w:val="22"/>
-                              </w:rPr>
-                              <w:t xml:space="preserve"> - </w:t>
-                            </w:r>
-                            <w:proofErr w:type="spellStart"/>
-                            <w:r>
-                              <w:rPr>
-                                <w:rFonts w:ascii="Courier New" w:hAnsi="Courier New" w:cs="Courier New"/>
-                                <w:b/>
-                                <w:color w:val="444444"/>
-                                <w:sz w:val="22"/>
-                                <w:szCs w:val="22"/>
-                              </w:rPr>
-                              <w:t>r_start</w:t>
-                            </w:r>
-                            <w:proofErr w:type="spellEnd"/>
-                            <w:r>
-                              <w:rPr>
-                                <w:rFonts w:ascii="Courier New" w:hAnsi="Courier New" w:cs="Courier New"/>
-                                <w:b/>
-                                <w:color w:val="444444"/>
-                                <w:sz w:val="22"/>
-                                <w:szCs w:val="22"/>
-                              </w:rPr>
-                              <w:t xml:space="preserve">) * s-&gt;col], </w:t>
+                              <w:t xml:space="preserve">(&amp;s-&gt;value[(i - r_start) * s-&gt;col], </w:t>
                             </w:r>
                             <w:r>
                               <w:rPr>
@@ -17731,51 +18495,7 @@
                                 <w:szCs w:val="22"/>
                               </w:rPr>
                               <w:br/>
-                              <w:t xml:space="preserve">           &amp;m-&gt;value[</w:t>
-                            </w:r>
-                            <w:proofErr w:type="spellStart"/>
-                            <w:r>
-                              <w:rPr>
-                                <w:rFonts w:ascii="Courier New" w:hAnsi="Courier New" w:cs="Courier New"/>
-                                <w:b/>
-                                <w:color w:val="444444"/>
-                                <w:sz w:val="22"/>
-                                <w:szCs w:val="22"/>
-                              </w:rPr>
-                              <w:t>i</w:t>
-                            </w:r>
-                            <w:proofErr w:type="spellEnd"/>
-                            <w:r>
-                              <w:rPr>
-                                <w:rFonts w:ascii="Courier New" w:hAnsi="Courier New" w:cs="Courier New"/>
-                                <w:b/>
-                                <w:color w:val="444444"/>
-                                <w:sz w:val="22"/>
-                                <w:szCs w:val="22"/>
-                              </w:rPr>
-                              <w:t xml:space="preserve"> * col + </w:t>
-                            </w:r>
-                            <w:proofErr w:type="spellStart"/>
-                            <w:r>
-                              <w:rPr>
-                                <w:rFonts w:ascii="Courier New" w:hAnsi="Courier New" w:cs="Courier New"/>
-                                <w:b/>
-                                <w:color w:val="444444"/>
-                                <w:sz w:val="22"/>
-                                <w:szCs w:val="22"/>
-                              </w:rPr>
-                              <w:t>c_start</w:t>
-                            </w:r>
-                            <w:proofErr w:type="spellEnd"/>
-                            <w:r>
-                              <w:rPr>
-                                <w:rFonts w:ascii="Courier New" w:hAnsi="Courier New" w:cs="Courier New"/>
-                                <w:b/>
-                                <w:color w:val="444444"/>
-                                <w:sz w:val="22"/>
-                                <w:szCs w:val="22"/>
-                              </w:rPr>
-                              <w:t xml:space="preserve">], </w:t>
+                              <w:t xml:space="preserve">           &amp;m-&gt;value[i * col + c_start], </w:t>
                             </w:r>
                             <w:r>
                               <w:rPr>
@@ -17786,29 +18506,7 @@
                                 <w:szCs w:val="22"/>
                               </w:rPr>
                               <w:br/>
-                              <w:t xml:space="preserve">           </w:t>
-                            </w:r>
-                            <w:proofErr w:type="spellStart"/>
-                            <w:r>
-                              <w:rPr>
-                                <w:rFonts w:ascii="Courier New" w:hAnsi="Courier New" w:cs="Courier New"/>
-                                <w:b/>
-                                <w:color w:val="444444"/>
-                                <w:sz w:val="22"/>
-                                <w:szCs w:val="22"/>
-                              </w:rPr>
-                              <w:t>sizeof</w:t>
-                            </w:r>
-                            <w:proofErr w:type="spellEnd"/>
-                            <w:r>
-                              <w:rPr>
-                                <w:rFonts w:ascii="Courier New" w:hAnsi="Courier New" w:cs="Courier New"/>
-                                <w:b/>
-                                <w:color w:val="444444"/>
-                                <w:sz w:val="22"/>
-                                <w:szCs w:val="22"/>
-                              </w:rPr>
-                              <w:t>(float) * s-&gt;col);</w:t>
+                              <w:t xml:space="preserve">           sizeof(float) * s-&gt;col);</w:t>
                             </w:r>
                             <w:r>
                               <w:rPr>
@@ -17875,7 +18573,6 @@
                         </w:rPr>
                         <w:t xml:space="preserve">for (int </w:t>
                       </w:r>
-                      <w:proofErr w:type="spellStart"/>
                       <w:r>
                         <w:rPr>
                           <w:rFonts w:ascii="Courier New" w:hAnsi="Courier New" w:cs="Courier New"/>
@@ -17884,106 +18581,7 @@
                           <w:sz w:val="22"/>
                           <w:szCs w:val="22"/>
                         </w:rPr>
-                        <w:t>i</w:t>
-                      </w:r>
-                      <w:proofErr w:type="spellEnd"/>
-                      <w:r>
-                        <w:rPr>
-                          <w:rFonts w:ascii="Courier New" w:hAnsi="Courier New" w:cs="Courier New"/>
-                          <w:b/>
-                          <w:color w:val="444444"/>
-                          <w:sz w:val="22"/>
-                          <w:szCs w:val="22"/>
-                        </w:rPr>
-                        <w:t xml:space="preserve"> = </w:t>
-                      </w:r>
-                      <w:proofErr w:type="spellStart"/>
-                      <w:r>
-                        <w:rPr>
-                          <w:rFonts w:ascii="Courier New" w:hAnsi="Courier New" w:cs="Courier New"/>
-                          <w:b/>
-                          <w:color w:val="444444"/>
-                          <w:sz w:val="22"/>
-                          <w:szCs w:val="22"/>
-                        </w:rPr>
-                        <w:t>r_start</w:t>
-                      </w:r>
-                      <w:proofErr w:type="spellEnd"/>
-                      <w:r>
-                        <w:rPr>
-                          <w:rFonts w:ascii="Courier New" w:hAnsi="Courier New" w:cs="Courier New"/>
-                          <w:b/>
-                          <w:color w:val="444444"/>
-                          <w:sz w:val="22"/>
-                          <w:szCs w:val="22"/>
-                        </w:rPr>
-                        <w:t xml:space="preserve">; </w:t>
-                      </w:r>
-                      <w:proofErr w:type="spellStart"/>
-                      <w:r>
-                        <w:rPr>
-                          <w:rFonts w:ascii="Courier New" w:hAnsi="Courier New" w:cs="Courier New"/>
-                          <w:b/>
-                          <w:color w:val="444444"/>
-                          <w:sz w:val="22"/>
-                          <w:szCs w:val="22"/>
-                        </w:rPr>
-                        <w:t>i</w:t>
-                      </w:r>
-                      <w:proofErr w:type="spellEnd"/>
-                      <w:r>
-                        <w:rPr>
-                          <w:rFonts w:ascii="Courier New" w:hAnsi="Courier New" w:cs="Courier New"/>
-                          <w:b/>
-                          <w:color w:val="444444"/>
-                          <w:sz w:val="22"/>
-                          <w:szCs w:val="22"/>
-                        </w:rPr>
-                        <w:t xml:space="preserve"> &lt; </w:t>
-                      </w:r>
-                      <w:proofErr w:type="spellStart"/>
-                      <w:r>
-                        <w:rPr>
-                          <w:rFonts w:ascii="Courier New" w:hAnsi="Courier New" w:cs="Courier New"/>
-                          <w:b/>
-                          <w:color w:val="444444"/>
-                          <w:sz w:val="22"/>
-                          <w:szCs w:val="22"/>
-                        </w:rPr>
-                        <w:t>r_end</w:t>
-                      </w:r>
-                      <w:proofErr w:type="spellEnd"/>
-                      <w:r>
-                        <w:rPr>
-                          <w:rFonts w:ascii="Courier New" w:hAnsi="Courier New" w:cs="Courier New"/>
-                          <w:b/>
-                          <w:color w:val="444444"/>
-                          <w:sz w:val="22"/>
-                          <w:szCs w:val="22"/>
-                        </w:rPr>
-                        <w:t>; ++</w:t>
-                      </w:r>
-                      <w:proofErr w:type="spellStart"/>
-                      <w:r>
-                        <w:rPr>
-                          <w:rFonts w:ascii="Courier New" w:hAnsi="Courier New" w:cs="Courier New"/>
-                          <w:b/>
-                          <w:color w:val="444444"/>
-                          <w:sz w:val="22"/>
-                          <w:szCs w:val="22"/>
-                        </w:rPr>
-                        <w:t>i</w:t>
-                      </w:r>
-                      <w:proofErr w:type="spellEnd"/>
-                      <w:r>
-                        <w:rPr>
-                          <w:rFonts w:ascii="Courier New" w:hAnsi="Courier New" w:cs="Courier New"/>
-                          <w:b/>
-                          <w:color w:val="444444"/>
-                          <w:sz w:val="22"/>
-                          <w:szCs w:val="22"/>
-                        </w:rPr>
-                        <w:t>) {</w:t>
+                        <w:t>i = r_start; i &lt; r_end; ++i) {</w:t>
                       </w:r>
                       <w:r>
                         <w:rPr>
@@ -18026,7 +18624,6 @@
                         <w:br/>
                         <w:t xml:space="preserve">    </w:t>
                       </w:r>
-                      <w:proofErr w:type="spellStart"/>
                       <w:r>
                         <w:rPr>
                           <w:rFonts w:ascii="Courier New" w:hAnsi="Courier New" w:cs="Courier New"/>
@@ -18037,7 +18634,6 @@
                         </w:rPr>
                         <w:t>memcpy</w:t>
                       </w:r>
-                      <w:proofErr w:type="spellEnd"/>
                       <w:r>
                         <w:rPr>
                           <w:rFonts w:ascii="Courier New" w:hAnsi="Courier New" w:cs="Courier New"/>
@@ -18046,51 +18642,7 @@
                           <w:sz w:val="22"/>
                           <w:szCs w:val="22"/>
                         </w:rPr>
-                        <w:t>(&amp;s-&gt;value[(</w:t>
-                      </w:r>
-                      <w:proofErr w:type="spellStart"/>
-                      <w:r>
-                        <w:rPr>
-                          <w:rFonts w:ascii="Courier New" w:hAnsi="Courier New" w:cs="Courier New"/>
-                          <w:b/>
-                          <w:color w:val="444444"/>
-                          <w:sz w:val="22"/>
-                          <w:szCs w:val="22"/>
-                        </w:rPr>
-                        <w:t>i</w:t>
-                      </w:r>
-                      <w:proofErr w:type="spellEnd"/>
-                      <w:r>
-                        <w:rPr>
-                          <w:rFonts w:ascii="Courier New" w:hAnsi="Courier New" w:cs="Courier New"/>
-                          <w:b/>
-                          <w:color w:val="444444"/>
-                          <w:sz w:val="22"/>
-                          <w:szCs w:val="22"/>
-                        </w:rPr>
-                        <w:t xml:space="preserve"> - </w:t>
-                      </w:r>
-                      <w:proofErr w:type="spellStart"/>
-                      <w:r>
-                        <w:rPr>
-                          <w:rFonts w:ascii="Courier New" w:hAnsi="Courier New" w:cs="Courier New"/>
-                          <w:b/>
-                          <w:color w:val="444444"/>
-                          <w:sz w:val="22"/>
-                          <w:szCs w:val="22"/>
-                        </w:rPr>
-                        <w:t>r_start</w:t>
-                      </w:r>
-                      <w:proofErr w:type="spellEnd"/>
-                      <w:r>
-                        <w:rPr>
-                          <w:rFonts w:ascii="Courier New" w:hAnsi="Courier New" w:cs="Courier New"/>
-                          <w:b/>
-                          <w:color w:val="444444"/>
-                          <w:sz w:val="22"/>
-                          <w:szCs w:val="22"/>
-                        </w:rPr>
-                        <w:t xml:space="preserve">) * s-&gt;col], </w:t>
+                        <w:t xml:space="preserve">(&amp;s-&gt;value[(i - r_start) * s-&gt;col], </w:t>
                       </w:r>
                       <w:r>
                         <w:rPr>
@@ -18101,51 +18653,7 @@
                           <w:szCs w:val="22"/>
                         </w:rPr>
                         <w:br/>
-                        <w:t xml:space="preserve">           &amp;m-&gt;value[</w:t>
-                      </w:r>
-                      <w:proofErr w:type="spellStart"/>
-                      <w:r>
-                        <w:rPr>
-                          <w:rFonts w:ascii="Courier New" w:hAnsi="Courier New" w:cs="Courier New"/>
-                          <w:b/>
-                          <w:color w:val="444444"/>
-                          <w:sz w:val="22"/>
-                          <w:szCs w:val="22"/>
-                        </w:rPr>
-                        <w:t>i</w:t>
-                      </w:r>
-                      <w:proofErr w:type="spellEnd"/>
-                      <w:r>
-                        <w:rPr>
-                          <w:rFonts w:ascii="Courier New" w:hAnsi="Courier New" w:cs="Courier New"/>
-                          <w:b/>
-                          <w:color w:val="444444"/>
-                          <w:sz w:val="22"/>
-                          <w:szCs w:val="22"/>
-                        </w:rPr>
-                        <w:t xml:space="preserve"> * col + </w:t>
-                      </w:r>
-                      <w:proofErr w:type="spellStart"/>
-                      <w:r>
-                        <w:rPr>
-                          <w:rFonts w:ascii="Courier New" w:hAnsi="Courier New" w:cs="Courier New"/>
-                          <w:b/>
-                          <w:color w:val="444444"/>
-                          <w:sz w:val="22"/>
-                          <w:szCs w:val="22"/>
-                        </w:rPr>
-                        <w:t>c_start</w:t>
-                      </w:r>
-                      <w:proofErr w:type="spellEnd"/>
-                      <w:r>
-                        <w:rPr>
-                          <w:rFonts w:ascii="Courier New" w:hAnsi="Courier New" w:cs="Courier New"/>
-                          <w:b/>
-                          <w:color w:val="444444"/>
-                          <w:sz w:val="22"/>
-                          <w:szCs w:val="22"/>
-                        </w:rPr>
-                        <w:t xml:space="preserve">], </w:t>
+                        <w:t xml:space="preserve">           &amp;m-&gt;value[i * col + c_start], </w:t>
                       </w:r>
                       <w:r>
                         <w:rPr>
@@ -18156,29 +18664,7 @@
                           <w:szCs w:val="22"/>
                         </w:rPr>
                         <w:br/>
-                        <w:t xml:space="preserve">           </w:t>
-                      </w:r>
-                      <w:proofErr w:type="spellStart"/>
-                      <w:r>
-                        <w:rPr>
-                          <w:rFonts w:ascii="Courier New" w:hAnsi="Courier New" w:cs="Courier New"/>
-                          <w:b/>
-                          <w:color w:val="444444"/>
-                          <w:sz w:val="22"/>
-                          <w:szCs w:val="22"/>
-                        </w:rPr>
-                        <w:t>sizeof</w:t>
-                      </w:r>
-                      <w:proofErr w:type="spellEnd"/>
-                      <w:r>
-                        <w:rPr>
-                          <w:rFonts w:ascii="Courier New" w:hAnsi="Courier New" w:cs="Courier New"/>
-                          <w:b/>
-                          <w:color w:val="444444"/>
-                          <w:sz w:val="22"/>
-                          <w:szCs w:val="22"/>
-                        </w:rPr>
-                        <w:t>(float) * s-&gt;col);</w:t>
+                        <w:t xml:space="preserve">           sizeof(float) * s-&gt;col);</w:t>
                       </w:r>
                       <w:r>
                         <w:rPr>
@@ -21437,23 +21923,13 @@
                               </w:rPr>
                               <w:t xml:space="preserve">for (int </w:t>
                             </w:r>
-                            <w:proofErr w:type="spellStart"/>
                             <w:r>
                               <w:rPr>
                                 <w:rFonts w:ascii="Courier New" w:hAnsi="Courier New" w:cs="Courier New"/>
                                 <w:b/>
                                 <w:color w:val="444444"/>
                               </w:rPr>
-                              <w:t>i</w:t>
-                            </w:r>
-                            <w:proofErr w:type="spellEnd"/>
-                            <w:r>
-                              <w:rPr>
-                                <w:rFonts w:ascii="Courier New" w:hAnsi="Courier New" w:cs="Courier New"/>
-                                <w:b/>
-                                <w:color w:val="444444"/>
-                              </w:rPr>
-                              <w:t xml:space="preserve"> = </w:t>
+                              <w:t xml:space="preserve">i = </w:t>
                             </w:r>
                             <w:r>
                               <w:rPr>
@@ -21469,43 +21945,7 @@
                                 <w:b/>
                                 <w:color w:val="444444"/>
                               </w:rPr>
-                              <w:t xml:space="preserve">; </w:t>
-                            </w:r>
-                            <w:proofErr w:type="spellStart"/>
-                            <w:r>
-                              <w:rPr>
-                                <w:rFonts w:ascii="Courier New" w:hAnsi="Courier New" w:cs="Courier New"/>
-                                <w:b/>
-                                <w:color w:val="444444"/>
-                              </w:rPr>
-                              <w:t>i</w:t>
-                            </w:r>
-                            <w:proofErr w:type="spellEnd"/>
-                            <w:r>
-                              <w:rPr>
-                                <w:rFonts w:ascii="Courier New" w:hAnsi="Courier New" w:cs="Courier New"/>
-                                <w:b/>
-                                <w:color w:val="444444"/>
-                              </w:rPr>
-                              <w:t xml:space="preserve"> &lt; count; ++</w:t>
-                            </w:r>
-                            <w:proofErr w:type="spellStart"/>
-                            <w:r>
-                              <w:rPr>
-                                <w:rFonts w:ascii="Courier New" w:hAnsi="Courier New" w:cs="Courier New"/>
-                                <w:b/>
-                                <w:color w:val="444444"/>
-                              </w:rPr>
-                              <w:t>i</w:t>
-                            </w:r>
-                            <w:proofErr w:type="spellEnd"/>
-                            <w:r>
-                              <w:rPr>
-                                <w:rFonts w:ascii="Courier New" w:hAnsi="Courier New" w:cs="Courier New"/>
-                                <w:b/>
-                                <w:color w:val="444444"/>
-                              </w:rPr>
-                              <w:t>) {</w:t>
+                              <w:t>; i &lt; count; ++i) {</w:t>
                             </w:r>
                             <w:r>
                               <w:rPr>
@@ -21514,43 +21954,7 @@
                                 <w:color w:val="444444"/>
                               </w:rPr>
                               <w:br/>
-                              <w:t xml:space="preserve">    new-&gt;value[</w:t>
-                            </w:r>
-                            <w:proofErr w:type="spellStart"/>
-                            <w:r>
-                              <w:rPr>
-                                <w:rFonts w:ascii="Courier New" w:hAnsi="Courier New" w:cs="Courier New"/>
-                                <w:b/>
-                                <w:color w:val="444444"/>
-                              </w:rPr>
-                              <w:t>i</w:t>
-                            </w:r>
-                            <w:proofErr w:type="spellEnd"/>
-                            <w:r>
-                              <w:rPr>
-                                <w:rFonts w:ascii="Courier New" w:hAnsi="Courier New" w:cs="Courier New"/>
-                                <w:b/>
-                                <w:color w:val="444444"/>
-                              </w:rPr>
-                              <w:t>] = a-&gt;value[</w:t>
-                            </w:r>
-                            <w:proofErr w:type="spellStart"/>
-                            <w:r>
-                              <w:rPr>
-                                <w:rFonts w:ascii="Courier New" w:hAnsi="Courier New" w:cs="Courier New"/>
-                                <w:b/>
-                                <w:color w:val="444444"/>
-                              </w:rPr>
-                              <w:t>i</w:t>
-                            </w:r>
-                            <w:proofErr w:type="spellEnd"/>
-                            <w:r>
-                              <w:rPr>
-                                <w:rFonts w:ascii="Courier New" w:hAnsi="Courier New" w:cs="Courier New"/>
-                                <w:b/>
-                                <w:color w:val="444444"/>
-                              </w:rPr>
-                              <w:t>] * b;</w:t>
+                              <w:t xml:space="preserve">    new-&gt;value[i] = a-&gt;value[i] * b;</w:t>
                             </w:r>
                             <w:r>
                               <w:rPr>
@@ -21614,23 +22018,13 @@
                         </w:rPr>
                         <w:t xml:space="preserve">for (int </w:t>
                       </w:r>
-                      <w:proofErr w:type="spellStart"/>
                       <w:r>
                         <w:rPr>
                           <w:rFonts w:ascii="Courier New" w:hAnsi="Courier New" w:cs="Courier New"/>
                           <w:b/>
                           <w:color w:val="444444"/>
                         </w:rPr>
-                        <w:t>i</w:t>
-                      </w:r>
-                      <w:proofErr w:type="spellEnd"/>
-                      <w:r>
-                        <w:rPr>
-                          <w:rFonts w:ascii="Courier New" w:hAnsi="Courier New" w:cs="Courier New"/>
-                          <w:b/>
-                          <w:color w:val="444444"/>
-                        </w:rPr>
-                        <w:t xml:space="preserve"> = </w:t>
+                        <w:t xml:space="preserve">i = </w:t>
                       </w:r>
                       <w:r>
                         <w:rPr>
@@ -21646,43 +22040,7 @@
                           <w:b/>
                           <w:color w:val="444444"/>
                         </w:rPr>
-                        <w:t xml:space="preserve">; </w:t>
-                      </w:r>
-                      <w:proofErr w:type="spellStart"/>
-                      <w:r>
-                        <w:rPr>
-                          <w:rFonts w:ascii="Courier New" w:hAnsi="Courier New" w:cs="Courier New"/>
-                          <w:b/>
-                          <w:color w:val="444444"/>
-                        </w:rPr>
-                        <w:t>i</w:t>
-                      </w:r>
-                      <w:proofErr w:type="spellEnd"/>
-                      <w:r>
-                        <w:rPr>
-                          <w:rFonts w:ascii="Courier New" w:hAnsi="Courier New" w:cs="Courier New"/>
-                          <w:b/>
-                          <w:color w:val="444444"/>
-                        </w:rPr>
-                        <w:t xml:space="preserve"> &lt; count; ++</w:t>
-                      </w:r>
-                      <w:proofErr w:type="spellStart"/>
-                      <w:r>
-                        <w:rPr>
-                          <w:rFonts w:ascii="Courier New" w:hAnsi="Courier New" w:cs="Courier New"/>
-                          <w:b/>
-                          <w:color w:val="444444"/>
-                        </w:rPr>
-                        <w:t>i</w:t>
-                      </w:r>
-                      <w:proofErr w:type="spellEnd"/>
-                      <w:r>
-                        <w:rPr>
-                          <w:rFonts w:ascii="Courier New" w:hAnsi="Courier New" w:cs="Courier New"/>
-                          <w:b/>
-                          <w:color w:val="444444"/>
-                        </w:rPr>
-                        <w:t>) {</w:t>
+                        <w:t>; i &lt; count; ++i) {</w:t>
                       </w:r>
                       <w:r>
                         <w:rPr>
@@ -21691,43 +22049,7 @@
                           <w:color w:val="444444"/>
                         </w:rPr>
                         <w:br/>
-                        <w:t xml:space="preserve">    new-&gt;value[</w:t>
-                      </w:r>
-                      <w:proofErr w:type="spellStart"/>
-                      <w:r>
-                        <w:rPr>
-                          <w:rFonts w:ascii="Courier New" w:hAnsi="Courier New" w:cs="Courier New"/>
-                          <w:b/>
-                          <w:color w:val="444444"/>
-                        </w:rPr>
-                        <w:t>i</w:t>
-                      </w:r>
-                      <w:proofErr w:type="spellEnd"/>
-                      <w:r>
-                        <w:rPr>
-                          <w:rFonts w:ascii="Courier New" w:hAnsi="Courier New" w:cs="Courier New"/>
-                          <w:b/>
-                          <w:color w:val="444444"/>
-                        </w:rPr>
-                        <w:t>] = a-&gt;value[</w:t>
-                      </w:r>
-                      <w:proofErr w:type="spellStart"/>
-                      <w:r>
-                        <w:rPr>
-                          <w:rFonts w:ascii="Courier New" w:hAnsi="Courier New" w:cs="Courier New"/>
-                          <w:b/>
-                          <w:color w:val="444444"/>
-                        </w:rPr>
-                        <w:t>i</w:t>
-                      </w:r>
-                      <w:proofErr w:type="spellEnd"/>
-                      <w:r>
-                        <w:rPr>
-                          <w:rFonts w:ascii="Courier New" w:hAnsi="Courier New" w:cs="Courier New"/>
-                          <w:b/>
-                          <w:color w:val="444444"/>
-                        </w:rPr>
-                        <w:t>] * b;</w:t>
+                        <w:t xml:space="preserve">    new-&gt;value[i] = a-&gt;value[i] * b;</w:t>
                       </w:r>
                       <w:r>
                         <w:rPr>
@@ -23955,23 +24277,13 @@
                               </w:rPr>
                               <w:t xml:space="preserve">for (int j = </w:t>
                             </w:r>
-                            <w:proofErr w:type="spellStart"/>
                             <w:r>
                               <w:rPr>
                                 <w:rFonts w:ascii="Courier New" w:hAnsi="Courier New" w:cs="Courier New"/>
                                 <w:b/>
                                 <w:color w:val="444444"/>
                               </w:rPr>
-                              <w:t>i</w:t>
-                            </w:r>
-                            <w:proofErr w:type="spellEnd"/>
-                            <w:r>
-                              <w:rPr>
-                                <w:rFonts w:ascii="Courier New" w:hAnsi="Courier New" w:cs="Courier New"/>
-                                <w:b/>
-                                <w:color w:val="444444"/>
-                              </w:rPr>
-                              <w:t xml:space="preserve"> + </w:t>
+                              <w:t xml:space="preserve">i + </w:t>
                             </w:r>
                             <w:r>
                               <w:rPr>
@@ -23998,41 +24310,13 @@
                               <w:br/>
                               <w:t xml:space="preserve">    float entry = k-&gt;</w:t>
                             </w:r>
-                            <w:proofErr w:type="gramStart"/>
                             <w:r>
                               <w:rPr>
                                 <w:rFonts w:ascii="Courier New" w:hAnsi="Courier New" w:cs="Courier New"/>
                                 <w:b/>
                                 <w:color w:val="444444"/>
                               </w:rPr>
-                              <w:t>value[</w:t>
-                            </w:r>
-                            <w:proofErr w:type="gramEnd"/>
-                            <w:r>
-                              <w:rPr>
-                                <w:rFonts w:ascii="Courier New" w:hAnsi="Courier New" w:cs="Courier New"/>
-                                <w:b/>
-                                <w:color w:val="444444"/>
-                              </w:rPr>
-                              <w:t xml:space="preserve">j * col + </w:t>
-                            </w:r>
-                            <w:proofErr w:type="spellStart"/>
-                            <w:r>
-                              <w:rPr>
-                                <w:rFonts w:ascii="Courier New" w:hAnsi="Courier New" w:cs="Courier New"/>
-                                <w:b/>
-                                <w:color w:val="444444"/>
-                              </w:rPr>
-                              <w:t>i</w:t>
-                            </w:r>
-                            <w:proofErr w:type="spellEnd"/>
-                            <w:r>
-                              <w:rPr>
-                                <w:rFonts w:ascii="Courier New" w:hAnsi="Courier New" w:cs="Courier New"/>
-                                <w:b/>
-                                <w:color w:val="444444"/>
-                              </w:rPr>
-                              <w:t>];</w:t>
+                              <w:t>value[j * col + i];</w:t>
                             </w:r>
                             <w:r>
                               <w:rPr>
@@ -24041,61 +24325,7 @@
                                 <w:color w:val="444444"/>
                               </w:rPr>
                               <w:br/>
-                              <w:t xml:space="preserve">    </w:t>
-                            </w:r>
-                            <w:proofErr w:type="spellStart"/>
-                            <w:r>
-                              <w:rPr>
-                                <w:rFonts w:ascii="Courier New" w:hAnsi="Courier New" w:cs="Courier New"/>
-                                <w:b/>
-                                <w:color w:val="444444"/>
-                              </w:rPr>
-                              <w:t>add_</w:t>
-                            </w:r>
-                            <w:proofErr w:type="gramStart"/>
-                            <w:r>
-                              <w:rPr>
-                                <w:rFonts w:ascii="Courier New" w:hAnsi="Courier New" w:cs="Courier New"/>
-                                <w:b/>
-                                <w:color w:val="444444"/>
-                              </w:rPr>
-                              <w:t>rows</w:t>
-                            </w:r>
-                            <w:proofErr w:type="spellEnd"/>
-                            <w:r>
-                              <w:rPr>
-                                <w:rFonts w:ascii="Courier New" w:hAnsi="Courier New" w:cs="Courier New"/>
-                                <w:b/>
-                                <w:color w:val="444444"/>
-                              </w:rPr>
-                              <w:t>(</w:t>
-                            </w:r>
-                            <w:proofErr w:type="gramEnd"/>
-                            <w:r>
-                              <w:rPr>
-                                <w:rFonts w:ascii="Courier New" w:hAnsi="Courier New" w:cs="Courier New"/>
-                                <w:b/>
-                                <w:color w:val="444444"/>
-                              </w:rPr>
-                              <w:t xml:space="preserve">k, j, </w:t>
-                            </w:r>
-                            <w:proofErr w:type="spellStart"/>
-                            <w:r>
-                              <w:rPr>
-                                <w:rFonts w:ascii="Courier New" w:hAnsi="Courier New" w:cs="Courier New"/>
-                                <w:b/>
-                                <w:color w:val="444444"/>
-                              </w:rPr>
-                              <w:t>i</w:t>
-                            </w:r>
-                            <w:proofErr w:type="spellEnd"/>
-                            <w:r>
-                              <w:rPr>
-                                <w:rFonts w:ascii="Courier New" w:hAnsi="Courier New" w:cs="Courier New"/>
-                                <w:b/>
-                                <w:color w:val="444444"/>
-                              </w:rPr>
-                              <w:t>, (</w:t>
+                              <w:t xml:space="preserve">    add_rows(k, j, i, (</w:t>
                             </w:r>
                             <w:r>
                               <w:rPr>
@@ -24175,23 +24405,13 @@
                         </w:rPr>
                         <w:t xml:space="preserve">for (int j = </w:t>
                       </w:r>
-                      <w:proofErr w:type="spellStart"/>
                       <w:r>
                         <w:rPr>
                           <w:rFonts w:ascii="Courier New" w:hAnsi="Courier New" w:cs="Courier New"/>
                           <w:b/>
                           <w:color w:val="444444"/>
                         </w:rPr>
-                        <w:t>i</w:t>
-                      </w:r>
-                      <w:proofErr w:type="spellEnd"/>
-                      <w:r>
-                        <w:rPr>
-                          <w:rFonts w:ascii="Courier New" w:hAnsi="Courier New" w:cs="Courier New"/>
-                          <w:b/>
-                          <w:color w:val="444444"/>
-                        </w:rPr>
-                        <w:t xml:space="preserve"> + </w:t>
+                        <w:t xml:space="preserve">i + </w:t>
                       </w:r>
                       <w:r>
                         <w:rPr>
@@ -24216,25 +24436,15 @@
                           <w:color w:val="444444"/>
                         </w:rPr>
                         <w:br/>
-                        <w:t xml:space="preserve">    float entry = k-&gt;value[j * col + </w:t>
+                        <w:t xml:space="preserve">    float entry = k-&gt;</w:t>
                       </w:r>
-                      <w:proofErr w:type="spellStart"/>
                       <w:r>
                         <w:rPr>
                           <w:rFonts w:ascii="Courier New" w:hAnsi="Courier New" w:cs="Courier New"/>
                           <w:b/>
                           <w:color w:val="444444"/>
                         </w:rPr>
-                        <w:t>i</w:t>
-                      </w:r>
-                      <w:proofErr w:type="spellEnd"/>
-                      <w:r>
-                        <w:rPr>
-                          <w:rFonts w:ascii="Courier New" w:hAnsi="Courier New" w:cs="Courier New"/>
-                          <w:b/>
-                          <w:color w:val="444444"/>
-                        </w:rPr>
-                        <w:t>];</w:t>
+                        <w:t>value[j * col + i];</w:t>
                       </w:r>
                       <w:r>
                         <w:rPr>
@@ -24243,43 +24453,7 @@
                           <w:color w:val="444444"/>
                         </w:rPr>
                         <w:br/>
-                        <w:t xml:space="preserve">    </w:t>
-                      </w:r>
-                      <w:proofErr w:type="spellStart"/>
-                      <w:r>
-                        <w:rPr>
-                          <w:rFonts w:ascii="Courier New" w:hAnsi="Courier New" w:cs="Courier New"/>
-                          <w:b/>
-                          <w:color w:val="444444"/>
-                        </w:rPr>
-                        <w:t>add_rows</w:t>
-                      </w:r>
-                      <w:proofErr w:type="spellEnd"/>
-                      <w:r>
-                        <w:rPr>
-                          <w:rFonts w:ascii="Courier New" w:hAnsi="Courier New" w:cs="Courier New"/>
-                          <w:b/>
-                          <w:color w:val="444444"/>
-                        </w:rPr>
-                        <w:t xml:space="preserve">(k, j, </w:t>
-                      </w:r>
-                      <w:proofErr w:type="spellStart"/>
-                      <w:r>
-                        <w:rPr>
-                          <w:rFonts w:ascii="Courier New" w:hAnsi="Courier New" w:cs="Courier New"/>
-                          <w:b/>
-                          <w:color w:val="444444"/>
-                        </w:rPr>
-                        <w:t>i</w:t>
-                      </w:r>
-                      <w:proofErr w:type="spellEnd"/>
-                      <w:r>
-                        <w:rPr>
-                          <w:rFonts w:ascii="Courier New" w:hAnsi="Courier New" w:cs="Courier New"/>
-                          <w:b/>
-                          <w:color w:val="444444"/>
-                        </w:rPr>
-                        <w:t>, (</w:t>
+                        <w:t xml:space="preserve">    add_rows(k, j, i, (</w:t>
                       </w:r>
                       <w:r>
                         <w:rPr>
@@ -28301,21 +28475,12 @@
                               </w:rPr>
                               <w:t>// Adding the bias of neuron '</w:t>
                             </w:r>
-                            <w:proofErr w:type="spellStart"/>
                             <w:r>
                               <w:rPr>
                                 <w:rFonts w:ascii="Courier New" w:hAnsi="Courier New" w:cs="Courier New"/>
                                 <w:color w:val="444444"/>
                               </w:rPr>
-                              <w:t>i</w:t>
-                            </w:r>
-                            <w:proofErr w:type="spellEnd"/>
-                            <w:r>
-                              <w:rPr>
-                                <w:rFonts w:ascii="Courier New" w:hAnsi="Courier New" w:cs="Courier New"/>
-                                <w:color w:val="444444"/>
-                              </w:rPr>
-                              <w:t>' to all batch samples 'j</w:t>
+                              <w:t>i' to all batch samples 'j</w:t>
                             </w:r>
                             <w:r>
                               <w:rPr>
@@ -28345,23 +28510,7 @@
                                 <w:rFonts w:ascii="Courier New" w:hAnsi="Courier New" w:cs="Courier New"/>
                                 <w:color w:val="444444"/>
                               </w:rPr>
-                              <w:t xml:space="preserve"> bias = b-&gt;value[</w:t>
-                            </w:r>
-                            <w:proofErr w:type="spellStart"/>
-                            <w:r>
-                              <w:rPr>
-                                <w:rFonts w:ascii="Courier New" w:hAnsi="Courier New" w:cs="Courier New"/>
-                                <w:color w:val="444444"/>
-                              </w:rPr>
-                              <w:t>i</w:t>
-                            </w:r>
-                            <w:proofErr w:type="spellEnd"/>
-                            <w:r>
-                              <w:rPr>
-                                <w:rFonts w:ascii="Courier New" w:hAnsi="Courier New" w:cs="Courier New"/>
-                                <w:color w:val="444444"/>
-                              </w:rPr>
-                              <w:t>];</w:t>
+                              <w:t xml:space="preserve"> bias = b-&gt;value[i];</w:t>
                             </w:r>
                             <w:r>
                               <w:rPr>
@@ -28415,7 +28564,6 @@
                               </w:rPr>
                               <w:t>; j &lt; col; ++</w:t>
                             </w:r>
-                            <w:proofErr w:type="gramStart"/>
                             <w:r>
                               <w:rPr>
                                 <w:rFonts w:ascii="Courier New" w:hAnsi="Courier New" w:cs="Courier New"/>
@@ -28423,39 +28571,13 @@
                               </w:rPr>
                               <w:t>j){</w:t>
                             </w:r>
-                            <w:proofErr w:type="gramEnd"/>
                             <w:r>
                               <w:rPr>
                                 <w:rFonts w:ascii="Courier New" w:hAnsi="Courier New" w:cs="Courier New"/>
                                 <w:color w:val="444444"/>
                               </w:rPr>
                               <w:br/>
-                              <w:t xml:space="preserve">        c-&gt;</w:t>
-                            </w:r>
-                            <w:proofErr w:type="gramStart"/>
-                            <w:r>
-                              <w:rPr>
-                                <w:rFonts w:ascii="Courier New" w:hAnsi="Courier New" w:cs="Courier New"/>
-                                <w:color w:val="444444"/>
-                              </w:rPr>
-                              <w:t>value[</w:t>
-                            </w:r>
-                            <w:proofErr w:type="spellStart"/>
-                            <w:proofErr w:type="gramEnd"/>
-                            <w:r>
-                              <w:rPr>
-                                <w:rFonts w:ascii="Courier New" w:hAnsi="Courier New" w:cs="Courier New"/>
-                                <w:color w:val="444444"/>
-                              </w:rPr>
-                              <w:t>i</w:t>
-                            </w:r>
-                            <w:proofErr w:type="spellEnd"/>
-                            <w:r>
-                              <w:rPr>
-                                <w:rFonts w:ascii="Courier New" w:hAnsi="Courier New" w:cs="Courier New"/>
-                                <w:color w:val="444444"/>
-                              </w:rPr>
-                              <w:t xml:space="preserve"> * col + j] += bias;</w:t>
+                              <w:t xml:space="preserve">        c-&gt;value[i * col + j] += bias;</w:t>
                             </w:r>
                             <w:r>
                               <w:rPr>
@@ -28463,17 +28585,8 @@
                                 <w:color w:val="444444"/>
                               </w:rPr>
                               <w:br/>
-                              <w:t xml:space="preserve">  </w:t>
+                              <w:t xml:space="preserve">    }</w:t>
                             </w:r>
-                            <w:proofErr w:type="gramStart"/>
-                            <w:r>
-                              <w:rPr>
-                                <w:rFonts w:ascii="Courier New" w:hAnsi="Courier New" w:cs="Courier New"/>
-                                <w:color w:val="444444"/>
-                              </w:rPr>
-                              <w:t xml:space="preserve">  }</w:t>
-                            </w:r>
-                            <w:proofErr w:type="gramEnd"/>
                           </w:p>
                           <w:p/>
                         </w:txbxContent>
@@ -28498,11 +28611,7 @@
           </mc:Choice>
           <mc:Fallback>
             <w:pict>
-              <v:shapetype w14:anchorId="2F18B2EF" id="_x0000_t202" coordsize="21600,21600" o:spt="202" path="m,l,21600r21600,l21600,xe">
-                <v:stroke joinstyle="miter"/>
-                <v:path gradientshapeok="t" o:connecttype="rect"/>
-              </v:shapetype>
-              <v:shape id="_x0000_s1031" type="#_x0000_t202" style="position:absolute;left:0;text-align:left;margin-left:58.25pt;margin-top:58.65pt;width:428.85pt;height:90.8pt;z-index:251670528;visibility:visible;mso-wrap-style:square;mso-width-percent:0;mso-height-percent:0;mso-wrap-distance-left:9pt;mso-wrap-distance-top:0;mso-wrap-distance-right:9pt;mso-wrap-distance-bottom:0;mso-position-horizontal:absolute;mso-position-horizontal-relative:text;mso-position-vertical:absolute;mso-position-vertical-relative:text;mso-width-percent:0;mso-height-percent:0;mso-width-relative:margin;mso-height-relative:margin;v-text-anchor:middle" o:gfxdata="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" filled="f" stroked="f" strokeweight=".5pt">
+              <v:shape w14:anchorId="2F18B2EF" id="_x0000_s1031" type="#_x0000_t202" style="position:absolute;left:0;text-align:left;margin-left:58.25pt;margin-top:58.65pt;width:428.85pt;height:90.8pt;z-index:251670528;visibility:visible;mso-wrap-style:square;mso-width-percent:0;mso-height-percent:0;mso-wrap-distance-left:9pt;mso-wrap-distance-top:0;mso-wrap-distance-right:9pt;mso-wrap-distance-bottom:0;mso-position-horizontal:absolute;mso-position-horizontal-relative:text;mso-position-vertical:absolute;mso-position-vertical-relative:text;mso-width-percent:0;mso-height-percent:0;mso-width-relative:margin;mso-height-relative:margin;v-text-anchor:middle" o:gfxdata="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" filled="f" stroked="f" strokeweight=".5pt">
                 <v:textbox>
                   <w:txbxContent>
                     <w:p>
@@ -28516,21 +28625,12 @@
                         </w:rPr>
                         <w:t>// Adding the bias of neuron '</w:t>
                       </w:r>
-                      <w:proofErr w:type="spellStart"/>
                       <w:r>
                         <w:rPr>
                           <w:rFonts w:ascii="Courier New" w:hAnsi="Courier New" w:cs="Courier New"/>
                           <w:color w:val="444444"/>
                         </w:rPr>
-                        <w:t>i</w:t>
-                      </w:r>
-                      <w:proofErr w:type="spellEnd"/>
-                      <w:r>
-                        <w:rPr>
-                          <w:rFonts w:ascii="Courier New" w:hAnsi="Courier New" w:cs="Courier New"/>
-                          <w:color w:val="444444"/>
-                        </w:rPr>
-                        <w:t>' to all batch samples 'j</w:t>
+                        <w:t>i' to all batch samples 'j</w:t>
                       </w:r>
                       <w:r>
                         <w:rPr>
@@ -28560,23 +28660,7 @@
                           <w:rFonts w:ascii="Courier New" w:hAnsi="Courier New" w:cs="Courier New"/>
                           <w:color w:val="444444"/>
                         </w:rPr>
-                        <w:t xml:space="preserve"> bias = b-&gt;value[</w:t>
-                      </w:r>
-                      <w:proofErr w:type="spellStart"/>
-                      <w:r>
-                        <w:rPr>
-                          <w:rFonts w:ascii="Courier New" w:hAnsi="Courier New" w:cs="Courier New"/>
-                          <w:color w:val="444444"/>
-                        </w:rPr>
-                        <w:t>i</w:t>
-                      </w:r>
-                      <w:proofErr w:type="spellEnd"/>
-                      <w:r>
-                        <w:rPr>
-                          <w:rFonts w:ascii="Courier New" w:hAnsi="Courier New" w:cs="Courier New"/>
-                          <w:color w:val="444444"/>
-                        </w:rPr>
-                        <w:t>];</w:t>
+                        <w:t xml:space="preserve"> bias = b-&gt;value[i];</w:t>
                       </w:r>
                       <w:r>
                         <w:rPr>
@@ -28630,7 +28714,6 @@
                         </w:rPr>
                         <w:t>; j &lt; col; ++</w:t>
                       </w:r>
-                      <w:proofErr w:type="gramStart"/>
                       <w:r>
                         <w:rPr>
                           <w:rFonts w:ascii="Courier New" w:hAnsi="Courier New" w:cs="Courier New"/>
@@ -28638,39 +28721,13 @@
                         </w:rPr>
                         <w:t>j){</w:t>
                       </w:r>
-                      <w:proofErr w:type="gramEnd"/>
                       <w:r>
                         <w:rPr>
                           <w:rFonts w:ascii="Courier New" w:hAnsi="Courier New" w:cs="Courier New"/>
                           <w:color w:val="444444"/>
                         </w:rPr>
                         <w:br/>
-                        <w:t xml:space="preserve">        c-&gt;</w:t>
-                      </w:r>
-                      <w:proofErr w:type="gramStart"/>
-                      <w:r>
-                        <w:rPr>
-                          <w:rFonts w:ascii="Courier New" w:hAnsi="Courier New" w:cs="Courier New"/>
-                          <w:color w:val="444444"/>
-                        </w:rPr>
-                        <w:t>value[</w:t>
-                      </w:r>
-                      <w:proofErr w:type="spellStart"/>
-                      <w:proofErr w:type="gramEnd"/>
-                      <w:r>
-                        <w:rPr>
-                          <w:rFonts w:ascii="Courier New" w:hAnsi="Courier New" w:cs="Courier New"/>
-                          <w:color w:val="444444"/>
-                        </w:rPr>
-                        <w:t>i</w:t>
-                      </w:r>
-                      <w:proofErr w:type="spellEnd"/>
-                      <w:r>
-                        <w:rPr>
-                          <w:rFonts w:ascii="Courier New" w:hAnsi="Courier New" w:cs="Courier New"/>
-                          <w:color w:val="444444"/>
-                        </w:rPr>
-                        <w:t xml:space="preserve"> * col + j] += bias;</w:t>
+                        <w:t xml:space="preserve">        c-&gt;value[i * col + j] += bias;</w:t>
                       </w:r>
                       <w:r>
                         <w:rPr>
@@ -28678,17 +28735,8 @@
                           <w:color w:val="444444"/>
                         </w:rPr>
                         <w:br/>
-                        <w:t xml:space="preserve">  </w:t>
+                        <w:t xml:space="preserve">    }</w:t>
                       </w:r>
-                      <w:proofErr w:type="gramStart"/>
-                      <w:r>
-                        <w:rPr>
-                          <w:rFonts w:ascii="Courier New" w:hAnsi="Courier New" w:cs="Courier New"/>
-                          <w:color w:val="444444"/>
-                        </w:rPr>
-                        <w:t xml:space="preserve">  }</w:t>
-                      </w:r>
-                      <w:proofErr w:type="gramEnd"/>
                     </w:p>
                     <w:p/>
                   </w:txbxContent>
@@ -32311,7 +32359,33 @@
           <w:sz w:val="28"/>
           <w:szCs w:val="28"/>
         </w:rPr>
-        <w:t xml:space="preserve"> matrix multiplication on a large dataset ($1,000,000$ elements per matrix).</w:t>
+        <w:t xml:space="preserve"> matrix multiplication on a large dataset </w:t>
+      </w:r>
+      <w:r>
+        <w:rPr>
+          <w:rFonts w:ascii="Times New Roman" w:hAnsi="Times New Roman" w:cs="Times New Roman"/>
+          <w:sz w:val="28"/>
+          <w:szCs w:val="28"/>
+        </w:rPr>
+        <w:t>(</w:t>
+      </w:r>
+      <m:oMath>
+        <m:r>
+          <w:rPr>
+            <w:rFonts w:ascii="Cambria Math" w:hAnsi="Cambria Math" w:cs="Times New Roman"/>
+            <w:sz w:val="28"/>
+            <w:szCs w:val="28"/>
+          </w:rPr>
+          <m:t>1,000,000</m:t>
+        </m:r>
+      </m:oMath>
+      <w:r>
+        <w:rPr>
+          <w:rFonts w:ascii="Times New Roman" w:hAnsi="Times New Roman" w:cs="Times New Roman"/>
+          <w:sz w:val="28"/>
+          <w:szCs w:val="28"/>
+        </w:rPr>
+        <w:t xml:space="preserve"> elements per matrix).</w:t>
       </w:r>
     </w:p>
     <w:p>

</xml_diff>